<commit_message>
Move limitation paragraph to correct position in Section 7
</commit_message>
<xml_diff>
--- a/manuscripts/can_llm_web_agents_verify_their_own_work_revised.docx
+++ b/manuscripts/can_llm_web_agents_verify_their_own_work_revised.docx
@@ -19694,6 +19694,11 @@
       </w:r>
     </w:p>
     <w:p>
+      <w:r>
+        <w:t>Limited generalizability. Our evaluation is confined to VisualWebArena, a controlled benchmark with known limitations. The failure taxonomy and verification dynamics observed here may not directly transfer to production web environments, where pages are more complex, dynamic, and adversarial. VWA tasks are relatively simple (single-page, single-goal); complex multi-step workflows (e.g., multi-page checkout, form filling with validation) may exhibit different failure modes and verification challenges. Additionally, our failure taxonomy (obvious/deceptive/partial) is VWA-specific and may require refinement for other benchmarks. Future work should evaluate on real-world tasks and diverse benchmarks to assess generalizability.</w:t>
+      </w:r>
+    </w:p>
+    <w:p>
       <w:pPr>
         <w:jc w:val="both"/>
         <w:rPr>
@@ -34821,11 +34826,6 @@
         <w:rPr>
           <w:rtl w:val="0"/>
         </w:rPr>
-      </w:r>
-    </w:p>
-    <w:p>
-      <w:r>
-        <w:t>Limited generalizability. Our evaluation is confined to VisualWebArena, a controlled benchmark with known limitations. The failure taxonomy and verification dynamics observed here may not directly transfer to production web environments, where pages are more complex, dynamic, and adversarial. VWA tasks are relatively simple (single-page, single-goal); complex multi-step workflows (e.g., multi-page checkout, form filling with validation) may exhibit different failure modes and verification challenges. Additionally, our failure taxonomy (obvious/deceptive/partial) is VWA-specific and may require refinement for other benchmarks. Future work should evaluate on real-world tasks and diverse benchmarks to assess generalizability.</w:t>
       </w:r>
     </w:p>
     <w:sectPr>

</xml_diff>

<commit_message>
Add highlighted PDF and updated manuscript with all changes
</commit_message>
<xml_diff>
--- a/manuscripts/can_llm_web_agents_verify_their_own_work_revised.docx
+++ b/manuscripts/can_llm_web_agents_verify_their_own_work_revised.docx
@@ -22,7 +22,7 @@
           <w:szCs w:val="44"/>
           <w:rtl w:val="0"/>
         </w:rPr>
-        <w:t xml:space="preserve">Can LLM Web Agents Verify Their Own Work? The Role of Visual and Textual References in Self-Verification</w:t>
+        <w:t>Can LLM Web Agents Verify Their Own Work? The Role of Visual and Textual References in Post-Hoc Verification</w:t>
       </w:r>
     </w:p>
     <w:p>
@@ -170,16 +170,15 @@
           <w:szCs w:val="20"/>
           <w:rtl w:val="0"/>
         </w:rPr>
-        <w:t xml:space="preserve">Abstract: </w:t>
-      </w:r>
-      <w:r>
-        <w:rPr>
-          <w:rFonts w:ascii="Times New Roman" w:cs="Times New Roman" w:eastAsia="Times New Roman" w:hAnsi="Times New Roman"/>
-          <w:sz w:val="20"/>
-          <w:szCs w:val="20"/>
-          <w:rtl w:val="0"/>
-        </w:rPr>
-        <w:t xml:space="preserve">Autonomous web agents powered by large multimodal models (LMMs) can now complete complex browser tasks, but determining </w:t>
+        <w:t>Abstract: Autonomous web agents powered by large multimodal models (LMMs) can now complete complex browser tasks, but determining whether a task succeeded remains an open problem. Current evaluation relies on brittle scripted oracles that cannot generalize across websites. We investigate whether LMMs can post-hoc verify task completion by examining a final screenshot, optionally augmented with a reference, either a textual description of the expected outcome or a screenshot from a successful human trajectory.</w:t>
+      </w:r>
+      <w:r>
+        <w:rPr>
+          <w:rFonts w:ascii="Times New Roman" w:cs="Times New Roman" w:eastAsia="Times New Roman" w:hAnsi="Times New Roman"/>
+          <w:sz w:val="20"/>
+          <w:szCs w:val="20"/>
+          <w:rtl w:val="0"/>
+        </w:rPr>
       </w:r>
       <w:r>
         <w:rPr>
@@ -190,16 +189,14 @@
           <w:szCs w:val="20"/>
           <w:rtl w:val="0"/>
         </w:rPr>
-        <w:t xml:space="preserve">whether</w:t>
-      </w:r>
-      <w:r>
-        <w:rPr>
-          <w:rFonts w:ascii="Times New Roman" w:cs="Times New Roman" w:eastAsia="Times New Roman" w:hAnsi="Times New Roman"/>
-          <w:sz w:val="20"/>
-          <w:szCs w:val="20"/>
-          <w:rtl w:val="0"/>
-        </w:rPr>
-        <w:t xml:space="preserve"> a task succeeded remains an open problem. Current evaluation relies on brittle scripted oracles that cannot generalize across websites. We investigate whether LMMs can </w:t>
+      </w:r>
+      <w:r>
+        <w:rPr>
+          <w:rFonts w:ascii="Times New Roman" w:cs="Times New Roman" w:eastAsia="Times New Roman" w:hAnsi="Times New Roman"/>
+          <w:sz w:val="20"/>
+          <w:szCs w:val="20"/>
+          <w:rtl w:val="0"/>
+        </w:rPr>
       </w:r>
       <w:r>
         <w:rPr>
@@ -210,16 +207,14 @@
           <w:szCs w:val="20"/>
           <w:rtl w:val="0"/>
         </w:rPr>
-        <w:t xml:space="preserve">self-verify</w:t>
-      </w:r>
-      <w:r>
-        <w:rPr>
-          <w:rFonts w:ascii="Times New Roman" w:cs="Times New Roman" w:eastAsia="Times New Roman" w:hAnsi="Times New Roman"/>
-          <w:sz w:val="20"/>
-          <w:szCs w:val="20"/>
-          <w:rtl w:val="0"/>
-        </w:rPr>
-        <w:t xml:space="preserve"> task completion by examining a final screenshot, optionally augmented with a reference, either a textual description of the expected outcome or a screenshot from a successful human trajectory.</w:t>
+      </w:r>
+      <w:r>
+        <w:rPr>
+          <w:rFonts w:ascii="Times New Roman" w:cs="Times New Roman" w:eastAsia="Times New Roman" w:hAnsi="Times New Roman"/>
+          <w:sz w:val="20"/>
+          <w:szCs w:val="20"/>
+          <w:rtl w:val="0"/>
+        </w:rPr>
       </w:r>
     </w:p>
     <w:p>
@@ -337,26 +332,27 @@
           <w:szCs w:val="20"/>
           <w:rtl w:val="0"/>
         </w:rPr>
-        <w:t xml:space="preserve">These results indicate that LMM-based self-verification is viable in this regime but is reference-dependent, and that the modality of the reference matters more than its mere presence. The findings are conditional on the VWA + GPT-4V/SoM setting; we release the full evaluation harness, prompts, results, and analysis tooling to support cross-benchmark, cross-agent, and cross-verifier replication.</w:t>
-      </w:r>
-    </w:p>
-    <w:p>
-      <w:pPr>
-        <w:jc w:val="both"/>
-        <w:rPr>
-          <w:rFonts w:ascii="Times New Roman" w:cs="Times New Roman" w:eastAsia="Times New Roman" w:hAnsi="Times New Roman"/>
-          <w:sz w:val="20"/>
-          <w:szCs w:val="20"/>
-        </w:rPr>
-      </w:pPr>
-      <w:r>
-        <w:rPr>
-          <w:rFonts w:ascii="Times New Roman" w:cs="Times New Roman" w:eastAsia="Times New Roman" w:hAnsi="Times New Roman"/>
-          <w:sz w:val="20"/>
-          <w:szCs w:val="20"/>
-          <w:rtl w:val="0"/>
-        </w:rPr>
-        <w:br w:type="textWrapping"/>
+        <w:t>These results indicate that LMM-based post-hoc verification is viable in this regime but is reference-dependent, and that the modality of the reference matters more than its mere presence. The findings are conditional on the VWA + GPT-4V/SoM setting; we release the full evaluation harness, prompts, results, and analysis tooling to support cross-benchmark, cross-agent, and cross-verifier replication.</w:t>
+      </w:r>
+    </w:p>
+    <w:p>
+      <w:pPr>
+        <w:jc w:val="both"/>
+        <w:rPr>
+          <w:rFonts w:ascii="Times New Roman" w:cs="Times New Roman" w:eastAsia="Times New Roman" w:hAnsi="Times New Roman"/>
+          <w:sz w:val="20"/>
+          <w:szCs w:val="20"/>
+        </w:rPr>
+      </w:pPr>
+      <w:r>
+        <w:rPr>
+          <w:rFonts w:ascii="Times New Roman" w:cs="Times New Roman" w:eastAsia="Times New Roman" w:hAnsi="Times New Roman"/>
+          <w:sz w:val="20"/>
+          <w:szCs w:val="20"/>
+          <w:rtl w:val="0"/>
+        </w:rPr>
+        <w:br/>
+        <w:t>Index Terms: large multimodal models, LLM-as-judge, autonomous web agents, post-hoc verification, task verification, confidence calibration, VisualWebArena, multimodal evaluation</w:t>
       </w:r>
       <w:r>
         <w:rPr>
@@ -367,16 +363,14 @@
           <w:szCs w:val="20"/>
           <w:rtl w:val="0"/>
         </w:rPr>
-        <w:t xml:space="preserve">Index Terms: </w:t>
-      </w:r>
-      <w:r>
-        <w:rPr>
-          <w:rFonts w:ascii="Times New Roman" w:cs="Times New Roman" w:eastAsia="Times New Roman" w:hAnsi="Times New Roman"/>
-          <w:sz w:val="20"/>
-          <w:szCs w:val="20"/>
-          <w:rtl w:val="0"/>
-        </w:rPr>
-        <w:t xml:space="preserve">large multimodal models, LLM-as-judge, autonomous web agents, self-verification, task verification, confidence calibration, VisualWebArena, multimodal evaluation</w:t>
+      </w:r>
+      <w:r>
+        <w:rPr>
+          <w:rFonts w:ascii="Times New Roman" w:cs="Times New Roman" w:eastAsia="Times New Roman" w:hAnsi="Times New Roman"/>
+          <w:sz w:val="20"/>
+          <w:szCs w:val="20"/>
+          <w:rtl w:val="0"/>
+        </w:rPr>
       </w:r>
     </w:p>
     <w:p>
@@ -952,16 +946,15 @@
           <w:szCs w:val="20"/>
           <w:rtl w:val="0"/>
         </w:rPr>
-        <w:t xml:space="preserve">A controlled comparison of reference modalities for LMM self-verification</w:t>
-      </w:r>
-      <w:r>
-        <w:rPr>
-          <w:rFonts w:ascii="Times New Roman" w:cs="Times New Roman" w:eastAsia="Times New Roman" w:hAnsi="Times New Roman"/>
-          <w:sz w:val="20"/>
-          <w:szCs w:val="20"/>
-          <w:rtl w:val="0"/>
-        </w:rPr>
-        <w:t xml:space="preserve"> on a fixed set of VWA trajectories across three closed-API model families, demonstrating that text references provide consistent, significant improvements (+5-21pp accuracy) while visual references are model-dependent, tolerated by Claude but harmful for GPT and Gemini models on the 147-instance visual-reference subset.</w:t>
+        <w:t>A controlled comparison of reference modalities for LMM post-hoc verification on a fixed set of VWA trajectories across three closed-API model families, demonstrating that text references provide consistent, significant improvements (+5-21pp accuracy) while visual references are model-dependent, tolerated by Claude but harmful for GPT and Gemini models on the 147-instance visual-reference subset.</w:t>
+      </w:r>
+      <w:r>
+        <w:rPr>
+          <w:rFonts w:ascii="Times New Roman" w:cs="Times New Roman" w:eastAsia="Times New Roman" w:hAnsi="Times New Roman"/>
+          <w:sz w:val="20"/>
+          <w:szCs w:val="20"/>
+          <w:rtl w:val="0"/>
+        </w:rPr>
       </w:r>
     </w:p>
     <w:p>
@@ -1294,7 +1287,7 @@
           <w:szCs w:val="20"/>
           <w:rtl w:val="0"/>
         </w:rPr>
-        <w:t xml:space="preserve">For visual evaluation, MMMU [9] and MMBench [10] assess model visual understanding but do not study self-verification in agentic settings. The closest work to ours is WebJudge [5], which uses GPT-4V to evaluate web agent trajectories; however, they do not systematically vary the reference information provided to the judge or analyze calibration properties. Broader agent benchmarks such as AgentBench [11], Mind2Web [12], and TravelPlanner [13] focus on agent capability rather than the verifier signal itself.</w:t>
+        <w:t>For visual evaluation, MMMU [9] and MMBench [10] assess model visual understanding but do not study post-hoc verification in agentic settings. The closest work to ours is WebJudge [5], which uses GPT-4V to evaluate web agent trajectories; however, they do not systematically vary the reference information provided to the judge or analyze calibration properties. Broader agent benchmarks such as AgentBench [11], Mind2Web [12], and TravelPlanner [13] focus on agent capability rather than the verifier signal itself.</w:t>
       </w:r>
     </w:p>
     <w:p>
@@ -1321,26 +1314,26 @@
           <w:szCs w:val="18"/>
           <w:rtl w:val="0"/>
         </w:rPr>
-        <w:t xml:space="preserve">2.3 Self-Verification and Self-Reflection</w:t>
-      </w:r>
-    </w:p>
-    <w:p>
-      <w:pPr>
-        <w:jc w:val="both"/>
-        <w:rPr>
-          <w:rFonts w:ascii="Times New Roman" w:cs="Times New Roman" w:eastAsia="Times New Roman" w:hAnsi="Times New Roman"/>
-          <w:sz w:val="20"/>
-          <w:szCs w:val="20"/>
-        </w:rPr>
-      </w:pPr>
-      <w:r>
-        <w:rPr>
-          <w:rFonts w:ascii="Times New Roman" w:cs="Times New Roman" w:eastAsia="Times New Roman" w:hAnsi="Times New Roman"/>
-          <w:sz w:val="20"/>
-          <w:szCs w:val="20"/>
-          <w:rtl w:val="0"/>
-        </w:rPr>
-        <w:t xml:space="preserve">Self-verification, an agent assessing its own output, is related to self-reflection [14], self-debugging [8], and ReAct-style reasoning-action loops [15]. Reflexion [14] demonstrated that iterative self-evaluation improves downstream task performance, but assumes the self-evaluation signal is reliable. Our work directly measures </w:t>
+        <w:t>2.3 Post-Hoc Verification and Self-Reflection</w:t>
+      </w:r>
+    </w:p>
+    <w:p>
+      <w:pPr>
+        <w:jc w:val="both"/>
+        <w:rPr>
+          <w:rFonts w:ascii="Times New Roman" w:cs="Times New Roman" w:eastAsia="Times New Roman" w:hAnsi="Times New Roman"/>
+          <w:sz w:val="20"/>
+          <w:szCs w:val="20"/>
+        </w:rPr>
+      </w:pPr>
+      <w:r>
+        <w:rPr>
+          <w:rFonts w:ascii="Times New Roman" w:cs="Times New Roman" w:eastAsia="Times New Roman" w:hAnsi="Times New Roman"/>
+          <w:sz w:val="20"/>
+          <w:szCs w:val="20"/>
+          <w:rtl w:val="0"/>
+        </w:rPr>
+        <w:t>Post-hoc verification, an agent assessing its own output, is related to self-reflection [14], self-debugging [8], and ReAct-style reasoning-action loops [15]. Reflexion [14] demonstrated that iterative self-evaluation improves downstream task performance, but assumes the self-evaluation signal is reliable. Our work directly measures how reliable that signal is and what information is required to make it useful.</w:t>
       </w:r>
       <w:r>
         <w:rPr>
@@ -1351,16 +1344,14 @@
           <w:szCs w:val="20"/>
           <w:rtl w:val="0"/>
         </w:rPr>
-        <w:t xml:space="preserve">how</w:t>
-      </w:r>
-      <w:r>
-        <w:rPr>
-          <w:rFonts w:ascii="Times New Roman" w:cs="Times New Roman" w:eastAsia="Times New Roman" w:hAnsi="Times New Roman"/>
-          <w:sz w:val="20"/>
-          <w:szCs w:val="20"/>
-          <w:rtl w:val="0"/>
-        </w:rPr>
-        <w:t xml:space="preserve"> reliable that signal is and what information is required to make it useful.</w:t>
+      </w:r>
+      <w:r>
+        <w:rPr>
+          <w:rFonts w:ascii="Times New Roman" w:cs="Times New Roman" w:eastAsia="Times New Roman" w:hAnsi="Times New Roman"/>
+          <w:sz w:val="20"/>
+          <w:szCs w:val="20"/>
+          <w:rtl w:val="0"/>
+        </w:rPr>
       </w:r>
     </w:p>
     <w:p>
@@ -1490,7 +1481,7 @@
           <w:szCs w:val="18"/>
           <w:rtl w:val="0"/>
         </w:rPr>
-        <w:t xml:space="preserve">3. The Visual Self-Verification Framework</w:t>
+        <w:t>3. The Visual Post-Hoc Verification Framework</w:t>
       </w:r>
     </w:p>
     <w:p>
@@ -2381,57 +2372,25 @@
           <w:szCs w:val="20"/>
           <w:rtl w:val="0"/>
         </w:rPr>
-        <w:br w:type="textWrapping"/>
-      </w:r>
-      <w:r>
-        <w:rPr>
-          <w:rFonts w:ascii="Times New Roman" w:cs="Times New Roman" w:eastAsia="Times New Roman" w:hAnsi="Times New Roman"/>
-          <w:sz w:val="20"/>
-          <w:szCs w:val="20"/>
-        </w:rPr>
-        <w:drawing>
-          <wp:inline distB="114300" distT="114300" distL="114300" distR="114300">
-            <wp:extent cx="2743200" cy="1143000"/>
-            <wp:effectExtent b="0" l="0" r="0" t="0"/>
-            <wp:docPr id="5" name="image6.png"/>
-            <a:graphic>
-              <a:graphicData uri="http://schemas.openxmlformats.org/drawingml/2006/picture">
-                <pic:pic>
-                  <pic:nvPicPr>
-                    <pic:cNvPr id="0" name="image6.png"/>
-                    <pic:cNvPicPr preferRelativeResize="0"/>
-                  </pic:nvPicPr>
-                  <pic:blipFill>
-                    <a:blip r:embed="rId7"/>
-                    <a:srcRect b="0" l="0" r="0" t="0"/>
-                    <a:stretch>
-                      <a:fillRect/>
-                    </a:stretch>
-                  </pic:blipFill>
-                  <pic:spPr>
-                    <a:xfrm>
-                      <a:off x="0" y="0"/>
-                      <a:ext cx="2743200" cy="1143000"/>
-                    </a:xfrm>
-                    <a:prstGeom prst="rect"/>
-                    <a:ln/>
-                  </pic:spPr>
-                </pic:pic>
-              </a:graphicData>
-            </a:graphic>
-          </wp:inline>
-        </w:drawing>
-      </w:r>
-      <w:r>
-        <w:rPr>
-          <w:rFonts w:ascii="Times New Roman" w:cs="Times New Roman" w:eastAsia="Times New Roman" w:hAnsi="Times New Roman"/>
-          <w:sz w:val="20"/>
-          <w:szCs w:val="20"/>
-          <w:rtl w:val="0"/>
-        </w:rPr>
-        <w:br w:type="textWrapping"/>
-        <w:t xml:space="preserve">Figure 1: Visual Self-Verification Framework, inputs, prompt construction, and outputs for each of the four conditions (A–D).</w:t>
-        <w:br w:type="textWrapping"/>
+        <w:br/>
+        <w:br/>
+        <w:t>Figure 1: Visual Post-Hoc Verification Framework, inputs, prompt construction, and outputs for each of the four conditions (A–D).</w:t>
+        <w:br/>
+      </w:r>
+      <w:r>
+        <w:rPr>
+          <w:rFonts w:ascii="Times New Roman" w:cs="Times New Roman" w:eastAsia="Times New Roman" w:hAnsi="Times New Roman"/>
+          <w:sz w:val="20"/>
+          <w:szCs w:val="20"/>
+        </w:rPr>
+      </w:r>
+      <w:r>
+        <w:rPr>
+          <w:rFonts w:ascii="Times New Roman" w:cs="Times New Roman" w:eastAsia="Times New Roman" w:hAnsi="Times New Roman"/>
+          <w:sz w:val="20"/>
+          <w:szCs w:val="20"/>
+          <w:rtl w:val="0"/>
+        </w:rPr>
       </w:r>
     </w:p>
     <w:p>
@@ -19971,7 +19930,7 @@
           <w:szCs w:val="20"/>
           <w:rtl w:val="0"/>
         </w:rPr>
-        <w:t xml:space="preserve">Automated self-verification can shift workload away from humans, but if treated as ground truth it can mask systematic failure modes. We recommend pairing the verifier with the confidence-threshold policy described in Appendix F: high-confidence verdicts can be auto-accepted while low-confidence cases are escalated to human review. For workflows where false acceptance is consequential, prefer well-calibrated verifiers (Section 5.5) and consider a conservative threshold on the SUCCESS class.</w:t>
+        <w:t>Automated post-hoc verification can shift workload away from humans, but if treated as ground truth it can mask systematic failure modes. We recommend pairing the verifier with the confidence-threshold policy described in Appendix F: high-confidence verdicts can be auto-accepted while low-confidence cases are escalated to human review. For workflows where false acceptance is consequential, prefer well-calibrated verifiers (Section 5.5) and consider a conservative threshold on the SUCCESS class.</w:t>
       </w:r>
     </w:p>
     <w:p>
@@ -20028,7 +19987,7 @@
           <w:szCs w:val="20"/>
           <w:rtl w:val="0"/>
         </w:rPr>
-        <w:t xml:space="preserve">We have presented a controlled study of reference-augmented LMM self-verification for web agents. Across 909 VisualWebArena trajectories, four reference conditions, and five frontier closed-API models from three families, three findings hold consistently in this setting: </w:t>
+        <w:t>We have presented a controlled study of reference-augmented LMM post-hoc verification for web agents. Across 909 VisualWebArena trajectories, four reference conditions, and five frontier closed-API models from three families, three findings hold consistently in this setting: text references significantly and uniformly improve verification, visual references degrade most models on the visual-reference subset, and adding a reference screenshot on top of a text reference does not help.</w:t>
       </w:r>
       <w:r>
         <w:rPr>
@@ -20039,7 +19998,6 @@
           <w:szCs w:val="20"/>
           <w:rtl w:val="0"/>
         </w:rPr>
-        <w:t xml:space="preserve">text references significantly and uniformly improve verification, visual references degrade most models on the visual-reference subset, and adding a reference screenshot on top of a text reference does not help.</w:t>
       </w:r>
       <w:r>
         <w:rPr>
@@ -30513,7 +30471,7 @@
           <w:szCs w:val="20"/>
           <w:rtl w:val="0"/>
         </w:rPr>
-        <w:t xml:space="preserve">This is a case where even the text reference fails to correct the model. The MCAT book page shows a cover image that </w:t>
+        <w:t>This is a case where even the text reference fails to correct the model. The MCAT book page shows a cover image that does include "2020-2021" text, but it is the wrong listing (wrong URL, wrong specific edition). The model fixates on the visible cover image rather than verifying the page identity. This illustrates the limits of post-hoc verification: when the visual evidence genuinely matches the description, even reference-augmented verification fails.</w:t>
       </w:r>
       <w:r>
         <w:rPr>
@@ -30524,16 +30482,14 @@
           <w:szCs w:val="20"/>
           <w:rtl w:val="0"/>
         </w:rPr>
-        <w:t xml:space="preserve">does</w:t>
-      </w:r>
-      <w:r>
-        <w:rPr>
-          <w:rFonts w:ascii="Times New Roman" w:cs="Times New Roman" w:eastAsia="Times New Roman" w:hAnsi="Times New Roman"/>
-          <w:sz w:val="20"/>
-          <w:szCs w:val="20"/>
-          <w:rtl w:val="0"/>
-        </w:rPr>
-        <w:t xml:space="preserve"> include "2020-2021" text, but it is the wrong listing (wrong URL, wrong specific edition). The model fixates on the visible cover image rather than verifying the page identity. This illustrates the limits of self-verification: when the visual evidence genuinely matches the description, even reference-augmented verification fails.</w:t>
+      </w:r>
+      <w:r>
+        <w:rPr>
+          <w:rFonts w:ascii="Times New Roman" w:cs="Times New Roman" w:eastAsia="Times New Roman" w:hAnsi="Times New Roman"/>
+          <w:sz w:val="20"/>
+          <w:szCs w:val="20"/>
+          <w:rtl w:val="0"/>
+        </w:rPr>
       </w:r>
     </w:p>
     <w:p>

</xml_diff>

<commit_message>
Fix manuscript: preserve all 8 images, add 5 new tables, update terminology
</commit_message>
<xml_diff>
--- a/manuscripts/can_llm_web_agents_verify_their_own_work_revised.docx
+++ b/manuscripts/can_llm_web_agents_verify_their_own_work_revised.docx
@@ -170,15 +170,16 @@
           <w:szCs w:val="20"/>
           <w:rtl w:val="0"/>
         </w:rPr>
-        <w:t>Abstract: Autonomous web agents powered by large multimodal models (LMMs) can now complete complex browser tasks, but determining whether a task succeeded remains an open problem. Current evaluation relies on brittle scripted oracles that cannot generalize across websites. We investigate whether LMMs can post-hoc verify task completion by examining a final screenshot, optionally augmented with a reference, either a textual description of the expected outcome or a screenshot from a successful human trajectory.</w:t>
-      </w:r>
-      <w:r>
-        <w:rPr>
-          <w:rFonts w:ascii="Times New Roman" w:cs="Times New Roman" w:eastAsia="Times New Roman" w:hAnsi="Times New Roman"/>
-          <w:sz w:val="20"/>
-          <w:szCs w:val="20"/>
-          <w:rtl w:val="0"/>
-        </w:rPr>
+        <w:t xml:space="preserve">Abstract: </w:t>
+      </w:r>
+      <w:r>
+        <w:rPr>
+          <w:rFonts w:ascii="Times New Roman" w:cs="Times New Roman" w:eastAsia="Times New Roman" w:hAnsi="Times New Roman"/>
+          <w:sz w:val="20"/>
+          <w:szCs w:val="20"/>
+          <w:rtl w:val="0"/>
+        </w:rPr>
+        <w:t xml:space="preserve">Autonomous web agents powered by large multimodal models (LMMs) can now complete complex browser tasks, but determining </w:t>
       </w:r>
       <w:r>
         <w:rPr>
@@ -189,14 +190,16 @@
           <w:szCs w:val="20"/>
           <w:rtl w:val="0"/>
         </w:rPr>
-      </w:r>
-      <w:r>
-        <w:rPr>
-          <w:rFonts w:ascii="Times New Roman" w:cs="Times New Roman" w:eastAsia="Times New Roman" w:hAnsi="Times New Roman"/>
-          <w:sz w:val="20"/>
-          <w:szCs w:val="20"/>
-          <w:rtl w:val="0"/>
-        </w:rPr>
+        <w:t xml:space="preserve">whether</w:t>
+      </w:r>
+      <w:r>
+        <w:rPr>
+          <w:rFonts w:ascii="Times New Roman" w:cs="Times New Roman" w:eastAsia="Times New Roman" w:hAnsi="Times New Roman"/>
+          <w:sz w:val="20"/>
+          <w:szCs w:val="20"/>
+          <w:rtl w:val="0"/>
+        </w:rPr>
+        <w:t xml:space="preserve"> a task succeeded remains an open problem. Current evaluation relies on brittle scripted oracles that cannot generalize across websites. We investigate whether LMMs can </w:t>
       </w:r>
       <w:r>
         <w:rPr>
@@ -207,14 +210,16 @@
           <w:szCs w:val="20"/>
           <w:rtl w:val="0"/>
         </w:rPr>
-      </w:r>
-      <w:r>
-        <w:rPr>
-          <w:rFonts w:ascii="Times New Roman" w:cs="Times New Roman" w:eastAsia="Times New Roman" w:hAnsi="Times New Roman"/>
-          <w:sz w:val="20"/>
-          <w:szCs w:val="20"/>
-          <w:rtl w:val="0"/>
-        </w:rPr>
+        <w:t>post-hoc verify</w:t>
+      </w:r>
+      <w:r>
+        <w:rPr>
+          <w:rFonts w:ascii="Times New Roman" w:cs="Times New Roman" w:eastAsia="Times New Roman" w:hAnsi="Times New Roman"/>
+          <w:sz w:val="20"/>
+          <w:szCs w:val="20"/>
+          <w:rtl w:val="0"/>
+        </w:rPr>
+        <w:t xml:space="preserve"> task completion by examining a final screenshot, optionally augmented with a reference, either a textual description of the expected outcome or a screenshot from a successful human trajectory.</w:t>
       </w:r>
     </w:p>
     <w:p>
@@ -351,8 +356,7 @@
           <w:szCs w:val="20"/>
           <w:rtl w:val="0"/>
         </w:rPr>
-        <w:br/>
-        <w:t>Index Terms: large multimodal models, LLM-as-judge, autonomous web agents, post-hoc verification, task verification, confidence calibration, VisualWebArena, multimodal evaluation</w:t>
+        <w:br w:type="textWrapping"/>
       </w:r>
       <w:r>
         <w:rPr>
@@ -363,14 +367,16 @@
           <w:szCs w:val="20"/>
           <w:rtl w:val="0"/>
         </w:rPr>
-      </w:r>
-      <w:r>
-        <w:rPr>
-          <w:rFonts w:ascii="Times New Roman" w:cs="Times New Roman" w:eastAsia="Times New Roman" w:hAnsi="Times New Roman"/>
-          <w:sz w:val="20"/>
-          <w:szCs w:val="20"/>
-          <w:rtl w:val="0"/>
-        </w:rPr>
+        <w:t xml:space="preserve">Index Terms: </w:t>
+      </w:r>
+      <w:r>
+        <w:rPr>
+          <w:rFonts w:ascii="Times New Roman" w:cs="Times New Roman" w:eastAsia="Times New Roman" w:hAnsi="Times New Roman"/>
+          <w:sz w:val="20"/>
+          <w:szCs w:val="20"/>
+          <w:rtl w:val="0"/>
+        </w:rPr>
+        <w:t>large multimodal models, LLM-as-judge, autonomous web agents, post-hoc verification, task verification, confidence calibration, VisualWebArena, multimodal evaluation</w:t>
       </w:r>
     </w:p>
     <w:p>
@@ -946,15 +952,16 @@
           <w:szCs w:val="20"/>
           <w:rtl w:val="0"/>
         </w:rPr>
-        <w:t>A controlled comparison of reference modalities for LMM post-hoc verification on a fixed set of VWA trajectories across three closed-API model families, demonstrating that text references provide consistent, significant improvements (+5-21pp accuracy) while visual references are model-dependent, tolerated by Claude but harmful for GPT and Gemini models on the 147-instance visual-reference subset.</w:t>
-      </w:r>
-      <w:r>
-        <w:rPr>
-          <w:rFonts w:ascii="Times New Roman" w:cs="Times New Roman" w:eastAsia="Times New Roman" w:hAnsi="Times New Roman"/>
-          <w:sz w:val="20"/>
-          <w:szCs w:val="20"/>
-          <w:rtl w:val="0"/>
-        </w:rPr>
+        <w:t>A controlled comparison of reference modalities for LMM post-hoc verification</w:t>
+      </w:r>
+      <w:r>
+        <w:rPr>
+          <w:rFonts w:ascii="Times New Roman" w:cs="Times New Roman" w:eastAsia="Times New Roman" w:hAnsi="Times New Roman"/>
+          <w:sz w:val="20"/>
+          <w:szCs w:val="20"/>
+          <w:rtl w:val="0"/>
+        </w:rPr>
+        <w:t xml:space="preserve"> on a fixed set of VWA trajectories across three closed-API model families, demonstrating that text references provide consistent, significant improvements (+5-21pp accuracy) while visual references are model-dependent, tolerated by Claude but harmful for GPT and Gemini models on the 147-instance visual-reference subset.</w:t>
       </w:r>
     </w:p>
     <w:p>
@@ -1333,7 +1340,7 @@
           <w:szCs w:val="20"/>
           <w:rtl w:val="0"/>
         </w:rPr>
-        <w:t>Post-hoc verification, an agent assessing its own output, is related to self-reflection [14], self-debugging [8], and ReAct-style reasoning-action loops [15]. Reflexion [14] demonstrated that iterative self-evaluation improves downstream task performance, but assumes the self-evaluation signal is reliable. Our work directly measures how reliable that signal is and what information is required to make it useful.</w:t>
+        <w:t xml:space="preserve">Post-hoc verification, an agent assessing its own output, is related to self-reflection [14], self-debugging [8], and ReAct-style reasoning-action loops [15]. Reflexion [14] demonstrated that iterative self-evaluation improves downstream task performance, but assumes the self-evaluation signal is reliable. Our work directly measures </w:t>
       </w:r>
       <w:r>
         <w:rPr>
@@ -1344,14 +1351,16 @@
           <w:szCs w:val="20"/>
           <w:rtl w:val="0"/>
         </w:rPr>
-      </w:r>
-      <w:r>
-        <w:rPr>
-          <w:rFonts w:ascii="Times New Roman" w:cs="Times New Roman" w:eastAsia="Times New Roman" w:hAnsi="Times New Roman"/>
-          <w:sz w:val="20"/>
-          <w:szCs w:val="20"/>
-          <w:rtl w:val="0"/>
-        </w:rPr>
+        <w:t xml:space="preserve">how</w:t>
+      </w:r>
+      <w:r>
+        <w:rPr>
+          <w:rFonts w:ascii="Times New Roman" w:cs="Times New Roman" w:eastAsia="Times New Roman" w:hAnsi="Times New Roman"/>
+          <w:sz w:val="20"/>
+          <w:szCs w:val="20"/>
+          <w:rtl w:val="0"/>
+        </w:rPr>
+        <w:t xml:space="preserve"> reliable that signal is and what information is required to make it useful.</w:t>
       </w:r>
     </w:p>
     <w:p>
@@ -2372,25 +2381,57 @@
           <w:szCs w:val="20"/>
           <w:rtl w:val="0"/>
         </w:rPr>
-        <w:br/>
+        <w:br w:type="textWrapping"/>
+      </w:r>
+      <w:r>
+        <w:rPr>
+          <w:rFonts w:ascii="Times New Roman" w:cs="Times New Roman" w:eastAsia="Times New Roman" w:hAnsi="Times New Roman"/>
+          <w:sz w:val="20"/>
+          <w:szCs w:val="20"/>
+        </w:rPr>
+        <w:drawing>
+          <wp:inline distB="114300" distT="114300" distL="114300" distR="114300">
+            <wp:extent cx="2743200" cy="1143000"/>
+            <wp:effectExtent b="0" l="0" r="0" t="0"/>
+            <wp:docPr id="5" name="image6.png"/>
+            <a:graphic>
+              <a:graphicData uri="http://schemas.openxmlformats.org/drawingml/2006/picture">
+                <pic:pic>
+                  <pic:nvPicPr>
+                    <pic:cNvPr id="0" name="image6.png"/>
+                    <pic:cNvPicPr preferRelativeResize="0"/>
+                  </pic:nvPicPr>
+                  <pic:blipFill>
+                    <a:blip r:embed="rId7"/>
+                    <a:srcRect b="0" l="0" r="0" t="0"/>
+                    <a:stretch>
+                      <a:fillRect/>
+                    </a:stretch>
+                  </pic:blipFill>
+                  <pic:spPr>
+                    <a:xfrm>
+                      <a:off x="0" y="0"/>
+                      <a:ext cx="2743200" cy="1143000"/>
+                    </a:xfrm>
+                    <a:prstGeom prst="rect"/>
+                    <a:ln/>
+                  </pic:spPr>
+                </pic:pic>
+              </a:graphicData>
+            </a:graphic>
+          </wp:inline>
+        </w:drawing>
+      </w:r>
+      <w:r>
+        <w:rPr>
+          <w:rFonts w:ascii="Times New Roman" w:cs="Times New Roman" w:eastAsia="Times New Roman" w:hAnsi="Times New Roman"/>
+          <w:sz w:val="20"/>
+          <w:szCs w:val="20"/>
+          <w:rtl w:val="0"/>
+        </w:rPr>
         <w:br/>
         <w:t>Figure 1: Visual Post-Hoc Verification Framework, inputs, prompt construction, and outputs for each of the four conditions (A–D).</w:t>
         <w:br/>
-      </w:r>
-      <w:r>
-        <w:rPr>
-          <w:rFonts w:ascii="Times New Roman" w:cs="Times New Roman" w:eastAsia="Times New Roman" w:hAnsi="Times New Roman"/>
-          <w:sz w:val="20"/>
-          <w:szCs w:val="20"/>
-        </w:rPr>
-      </w:r>
-      <w:r>
-        <w:rPr>
-          <w:rFonts w:ascii="Times New Roman" w:cs="Times New Roman" w:eastAsia="Times New Roman" w:hAnsi="Times New Roman"/>
-          <w:sz w:val="20"/>
-          <w:szCs w:val="20"/>
-          <w:rtl w:val="0"/>
-        </w:rPr>
       </w:r>
     </w:p>
     <w:p>
@@ -12858,6 +12899,227 @@
         <w:t xml:space="preserve">. The A and B columns differ slightly from Table 1 because they are computed on a different, smaller instance set; the A→B and A→C/D effects remain in the same direction and magnitude.</w:t>
       </w:r>
     </w:p>
+    <w:tbl>
+      <w:tblPr>
+        <w:tblW w:type="auto" w:w="0"/>
+        <w:tblLook w:firstColumn="1" w:firstRow="1" w:lastColumn="0" w:lastRow="0" w:noHBand="0" w:noVBand="1" w:val="04A0"/>
+      </w:tblPr>
+      <w:tblGrid>
+        <w:gridCol w:w="1872"/>
+        <w:gridCol w:w="1872"/>
+        <w:gridCol w:w="1872"/>
+        <w:gridCol w:w="1872"/>
+        <w:gridCol w:w="1872"/>
+      </w:tblGrid>
+      <w:tr>
+        <w:tc>
+          <w:tcPr>
+            <w:tcW w:type="dxa" w:w="1872"/>
+          </w:tcPr>
+          <w:p>
+            <w:r>
+              <w:t>Model</w:t>
+            </w:r>
+          </w:p>
+        </w:tc>
+        <w:tc>
+          <w:tcPr>
+            <w:tcW w:type="dxa" w:w="1872"/>
+          </w:tcPr>
+          <w:p>
+            <w:r>
+              <w:t>Condition</w:t>
+            </w:r>
+          </w:p>
+        </w:tc>
+        <w:tc>
+          <w:tcPr>
+            <w:tcW w:type="dxa" w:w="1872"/>
+          </w:tcPr>
+          <w:p>
+            <w:r>
+              <w:t>Refs</w:t>
+            </w:r>
+          </w:p>
+        </w:tc>
+        <w:tc>
+          <w:tcPr>
+            <w:tcW w:type="dxa" w:w="1872"/>
+          </w:tcPr>
+          <w:p>
+            <w:r>
+              <w:t>Accuracy</w:t>
+            </w:r>
+          </w:p>
+        </w:tc>
+        <w:tc>
+          <w:tcPr>
+            <w:tcW w:type="dxa" w:w="1872"/>
+          </w:tcPr>
+          <w:p>
+            <w:r>
+              <w:t>A→B Lift</w:t>
+            </w:r>
+          </w:p>
+        </w:tc>
+      </w:tr>
+      <w:tr>
+        <w:tc>
+          <w:tcPr>
+            <w:tcW w:type="dxa" w:w="1872"/>
+          </w:tcPr>
+          <w:p>
+            <w:r>
+              <w:t>GPT-4.1 Nano</w:t>
+            </w:r>
+          </w:p>
+        </w:tc>
+        <w:tc>
+          <w:tcPr>
+            <w:tcW w:type="dxa" w:w="1872"/>
+          </w:tcPr>
+          <w:p>
+            <w:r>
+              <w:t>B</w:t>
+            </w:r>
+          </w:p>
+        </w:tc>
+        <w:tc>
+          <w:tcPr>
+            <w:tcW w:type="dxa" w:w="1872"/>
+          </w:tcPr>
+          <w:p>
+            <w:r>
+              <w:t>Self-generated</w:t>
+            </w:r>
+          </w:p>
+        </w:tc>
+        <w:tc>
+          <w:tcPr>
+            <w:tcW w:type="dxa" w:w="1872"/>
+          </w:tcPr>
+          <w:p>
+            <w:r>
+              <w:t>83.5%</w:t>
+            </w:r>
+          </w:p>
+        </w:tc>
+        <w:tc>
+          <w:tcPr>
+            <w:tcW w:type="dxa" w:w="1872"/>
+          </w:tcPr>
+          <w:p>
+            <w:r>
+              <w:t>+6.9pp</w:t>
+            </w:r>
+          </w:p>
+        </w:tc>
+      </w:tr>
+      <w:tr>
+        <w:tc>
+          <w:tcPr>
+            <w:tcW w:type="dxa" w:w="1872"/>
+          </w:tcPr>
+          <w:p>
+            <w:r>
+              <w:t>GPT-4.1 Nano</w:t>
+            </w:r>
+          </w:p>
+        </w:tc>
+        <w:tc>
+          <w:tcPr>
+            <w:tcW w:type="dxa" w:w="1872"/>
+          </w:tcPr>
+          <w:p>
+            <w:r>
+              <w:t>B</w:t>
+            </w:r>
+          </w:p>
+        </w:tc>
+        <w:tc>
+          <w:tcPr>
+            <w:tcW w:type="dxa" w:w="1872"/>
+          </w:tcPr>
+          <w:p>
+            <w:r>
+              <w:t>GPT-4.1-mini</w:t>
+            </w:r>
+          </w:p>
+        </w:tc>
+        <w:tc>
+          <w:tcPr>
+            <w:tcW w:type="dxa" w:w="1872"/>
+          </w:tcPr>
+          <w:p>
+            <w:r>
+              <w:t>76.8%</w:t>
+            </w:r>
+          </w:p>
+        </w:tc>
+        <w:tc>
+          <w:tcPr>
+            <w:tcW w:type="dxa" w:w="1872"/>
+          </w:tcPr>
+          <w:p>
+            <w:r>
+              <w:t>+0.2pp</w:t>
+            </w:r>
+          </w:p>
+        </w:tc>
+      </w:tr>
+      <w:tr>
+        <w:tc>
+          <w:tcPr>
+            <w:tcW w:type="dxa" w:w="1872"/>
+          </w:tcPr>
+          <w:p>
+            <w:r>
+              <w:t>GPT-4.1 Nano</w:t>
+            </w:r>
+          </w:p>
+        </w:tc>
+        <w:tc>
+          <w:tcPr>
+            <w:tcW w:type="dxa" w:w="1872"/>
+          </w:tcPr>
+          <w:p>
+            <w:r>
+              <w:t>B</w:t>
+            </w:r>
+          </w:p>
+        </w:tc>
+        <w:tc>
+          <w:tcPr>
+            <w:tcW w:type="dxa" w:w="1872"/>
+          </w:tcPr>
+          <w:p>
+            <w:r>
+              <w:t>Claude Sonnet 4</w:t>
+            </w:r>
+          </w:p>
+        </w:tc>
+        <w:tc>
+          <w:tcPr>
+            <w:tcW w:type="dxa" w:w="1872"/>
+          </w:tcPr>
+          <w:p>
+            <w:r>
+              <w:t>79.4%</w:t>
+            </w:r>
+          </w:p>
+        </w:tc>
+        <w:tc>
+          <w:tcPr>
+            <w:tcW w:type="dxa" w:w="1872"/>
+          </w:tcPr>
+          <w:p>
+            <w:r>
+              <w:t>+2.9pp</w:t>
+            </w:r>
+          </w:p>
+        </w:tc>
+      </w:tr>
+    </w:tbl>
     <w:p>
       <w:pPr>
         <w:jc w:val="both"/>
@@ -19987,7 +20249,7 @@
           <w:szCs w:val="20"/>
           <w:rtl w:val="0"/>
         </w:rPr>
-        <w:t>We have presented a controlled study of reference-augmented LMM post-hoc verification for web agents. Across 909 VisualWebArena trajectories, four reference conditions, and five frontier closed-API models from three families, three findings hold consistently in this setting: text references significantly and uniformly improve verification, visual references degrade most models on the visual-reference subset, and adding a reference screenshot on top of a text reference does not help.</w:t>
+        <w:t xml:space="preserve">We have presented a controlled study of reference-augmented LMM post-hoc verification for web agents. Across 909 VisualWebArena trajectories, four reference conditions, and five frontier closed-API models from three families, three findings hold consistently in this setting: </w:t>
       </w:r>
       <w:r>
         <w:rPr>
@@ -19998,6 +20260,7 @@
           <w:szCs w:val="20"/>
           <w:rtl w:val="0"/>
         </w:rPr>
+        <w:t xml:space="preserve">text references significantly and uniformly improve verification, visual references degrade most models on the visual-reference subset, and adding a reference screenshot on top of a text reference does not help.</w:t>
       </w:r>
       <w:r>
         <w:rPr>
@@ -30471,7 +30734,7 @@
           <w:szCs w:val="20"/>
           <w:rtl w:val="0"/>
         </w:rPr>
-        <w:t>This is a case where even the text reference fails to correct the model. The MCAT book page shows a cover image that does include "2020-2021" text, but it is the wrong listing (wrong URL, wrong specific edition). The model fixates on the visible cover image rather than verifying the page identity. This illustrates the limits of post-hoc verification: when the visual evidence genuinely matches the description, even reference-augmented verification fails.</w:t>
+        <w:t xml:space="preserve">This is a case where even the text reference fails to correct the model. The MCAT book page shows a cover image that </w:t>
       </w:r>
       <w:r>
         <w:rPr>
@@ -30482,14 +30745,16 @@
           <w:szCs w:val="20"/>
           <w:rtl w:val="0"/>
         </w:rPr>
-      </w:r>
-      <w:r>
-        <w:rPr>
-          <w:rFonts w:ascii="Times New Roman" w:cs="Times New Roman" w:eastAsia="Times New Roman" w:hAnsi="Times New Roman"/>
-          <w:sz w:val="20"/>
-          <w:szCs w:val="20"/>
-          <w:rtl w:val="0"/>
-        </w:rPr>
+        <w:t xml:space="preserve">does</w:t>
+      </w:r>
+      <w:r>
+        <w:rPr>
+          <w:rFonts w:ascii="Times New Roman" w:cs="Times New Roman" w:eastAsia="Times New Roman" w:hAnsi="Times New Roman"/>
+          <w:sz w:val="20"/>
+          <w:szCs w:val="20"/>
+          <w:rtl w:val="0"/>
+        </w:rPr>
+        <w:t xml:space="preserve"> include "2020-2021" text, but it is the wrong listing (wrong URL, wrong specific edition). The model fixates on the visible cover image rather than verifying the page identity. This illustrates the limits of post-hoc verification: when the visual evidence genuinely matches the description, even reference-augmented verification fails.</w:t>
       </w:r>
     </w:p>
     <w:p>
@@ -34782,6 +35047,1320 @@
         <w:rPr>
           <w:rtl w:val="0"/>
         </w:rPr>
+      </w:r>
+    </w:p>
+    <w:p>
+      <w:r>
+        <w:rPr>
+          <w:b/>
+          <w:sz w:val="18"/>
+        </w:rPr>
+        <w:t>Table N: Cross-model text reference verification results. The A→B lift largely disappears when using independently generated references.</w:t>
+      </w:r>
+    </w:p>
+    <w:tbl>
+      <w:tblPr>
+        <w:tblW w:type="auto" w:w="0"/>
+        <w:tblLook w:firstColumn="1" w:firstRow="1" w:lastColumn="0" w:lastRow="0" w:noHBand="0" w:noVBand="1" w:val="04A0"/>
+      </w:tblPr>
+      <w:tblGrid>
+        <w:gridCol w:w="1872"/>
+        <w:gridCol w:w="1872"/>
+        <w:gridCol w:w="1872"/>
+        <w:gridCol w:w="1872"/>
+        <w:gridCol w:w="1872"/>
+      </w:tblGrid>
+      <w:tr>
+        <w:tc>
+          <w:tcPr>
+            <w:tcW w:type="dxa" w:w="1872"/>
+          </w:tcPr>
+          <w:p>
+            <w:r>
+              <w:t>Model</w:t>
+            </w:r>
+          </w:p>
+        </w:tc>
+        <w:tc>
+          <w:tcPr>
+            <w:tcW w:type="dxa" w:w="1872"/>
+          </w:tcPr>
+          <w:p>
+            <w:r>
+              <w:t>Condition</w:t>
+            </w:r>
+          </w:p>
+        </w:tc>
+        <w:tc>
+          <w:tcPr>
+            <w:tcW w:type="dxa" w:w="1872"/>
+          </w:tcPr>
+          <w:p>
+            <w:r>
+              <w:t>Refs</w:t>
+            </w:r>
+          </w:p>
+        </w:tc>
+        <w:tc>
+          <w:tcPr>
+            <w:tcW w:type="dxa" w:w="1872"/>
+          </w:tcPr>
+          <w:p>
+            <w:r>
+              <w:t>Accuracy</w:t>
+            </w:r>
+          </w:p>
+        </w:tc>
+        <w:tc>
+          <w:tcPr>
+            <w:tcW w:type="dxa" w:w="1872"/>
+          </w:tcPr>
+          <w:p>
+            <w:r>
+              <w:t>A→B Lift</w:t>
+            </w:r>
+          </w:p>
+        </w:tc>
+      </w:tr>
+      <w:tr>
+        <w:tc>
+          <w:tcPr>
+            <w:tcW w:type="dxa" w:w="1872"/>
+          </w:tcPr>
+          <w:p>
+            <w:r>
+              <w:t>GPT-4.1 Nano</w:t>
+            </w:r>
+          </w:p>
+        </w:tc>
+        <w:tc>
+          <w:tcPr>
+            <w:tcW w:type="dxa" w:w="1872"/>
+          </w:tcPr>
+          <w:p>
+            <w:r>
+              <w:t>B</w:t>
+            </w:r>
+          </w:p>
+        </w:tc>
+        <w:tc>
+          <w:tcPr>
+            <w:tcW w:type="dxa" w:w="1872"/>
+          </w:tcPr>
+          <w:p>
+            <w:r>
+              <w:t>Self-generated</w:t>
+            </w:r>
+          </w:p>
+        </w:tc>
+        <w:tc>
+          <w:tcPr>
+            <w:tcW w:type="dxa" w:w="1872"/>
+          </w:tcPr>
+          <w:p>
+            <w:r>
+              <w:t>83.5%</w:t>
+            </w:r>
+          </w:p>
+        </w:tc>
+        <w:tc>
+          <w:tcPr>
+            <w:tcW w:type="dxa" w:w="1872"/>
+          </w:tcPr>
+          <w:p>
+            <w:r>
+              <w:t>+6.9pp</w:t>
+            </w:r>
+          </w:p>
+        </w:tc>
+      </w:tr>
+      <w:tr>
+        <w:tc>
+          <w:tcPr>
+            <w:tcW w:type="dxa" w:w="1872"/>
+          </w:tcPr>
+          <w:p>
+            <w:r>
+              <w:t>GPT-4.1 Nano</w:t>
+            </w:r>
+          </w:p>
+        </w:tc>
+        <w:tc>
+          <w:tcPr>
+            <w:tcW w:type="dxa" w:w="1872"/>
+          </w:tcPr>
+          <w:p>
+            <w:r>
+              <w:t>B</w:t>
+            </w:r>
+          </w:p>
+        </w:tc>
+        <w:tc>
+          <w:tcPr>
+            <w:tcW w:type="dxa" w:w="1872"/>
+          </w:tcPr>
+          <w:p>
+            <w:r>
+              <w:t>GPT-4.1-mini</w:t>
+            </w:r>
+          </w:p>
+        </w:tc>
+        <w:tc>
+          <w:tcPr>
+            <w:tcW w:type="dxa" w:w="1872"/>
+          </w:tcPr>
+          <w:p>
+            <w:r>
+              <w:t>76.8%</w:t>
+            </w:r>
+          </w:p>
+        </w:tc>
+        <w:tc>
+          <w:tcPr>
+            <w:tcW w:type="dxa" w:w="1872"/>
+          </w:tcPr>
+          <w:p>
+            <w:r>
+              <w:t>+0.2pp</w:t>
+            </w:r>
+          </w:p>
+        </w:tc>
+      </w:tr>
+      <w:tr>
+        <w:tc>
+          <w:tcPr>
+            <w:tcW w:type="dxa" w:w="1872"/>
+          </w:tcPr>
+          <w:p>
+            <w:r>
+              <w:t>GPT-4.1 Nano</w:t>
+            </w:r>
+          </w:p>
+        </w:tc>
+        <w:tc>
+          <w:tcPr>
+            <w:tcW w:type="dxa" w:w="1872"/>
+          </w:tcPr>
+          <w:p>
+            <w:r>
+              <w:t>B</w:t>
+            </w:r>
+          </w:p>
+        </w:tc>
+        <w:tc>
+          <w:tcPr>
+            <w:tcW w:type="dxa" w:w="1872"/>
+          </w:tcPr>
+          <w:p>
+            <w:r>
+              <w:t>Claude Sonnet 4</w:t>
+            </w:r>
+          </w:p>
+        </w:tc>
+        <w:tc>
+          <w:tcPr>
+            <w:tcW w:type="dxa" w:w="1872"/>
+          </w:tcPr>
+          <w:p>
+            <w:r>
+              <w:t>79.4%</w:t>
+            </w:r>
+          </w:p>
+        </w:tc>
+        <w:tc>
+          <w:tcPr>
+            <w:tcW w:type="dxa" w:w="1872"/>
+          </w:tcPr>
+          <w:p>
+            <w:r>
+              <w:t>+2.9pp</w:t>
+            </w:r>
+          </w:p>
+        </w:tc>
+      </w:tr>
+    </w:tbl>
+    <w:p>
+      <w:r>
+        <w:rPr>
+          <w:b/>
+          <w:sz w:val="18"/>
+        </w:rPr>
+        <w:t>Table N: Cross-model text reference verification results. The A→B lift largely disappears when using independently generated references.</w:t>
+      </w:r>
+    </w:p>
+    <w:tbl>
+      <w:tblPr>
+        <w:tblW w:type="auto" w:w="0"/>
+        <w:tblLook w:firstColumn="1" w:firstRow="1" w:lastColumn="0" w:lastRow="0" w:noHBand="0" w:noVBand="1" w:val="04A0"/>
+      </w:tblPr>
+      <w:tblGrid>
+        <w:gridCol w:w="1560"/>
+        <w:gridCol w:w="1560"/>
+        <w:gridCol w:w="1560"/>
+        <w:gridCol w:w="1560"/>
+        <w:gridCol w:w="1560"/>
+        <w:gridCol w:w="1560"/>
+      </w:tblGrid>
+      <w:tr>
+        <w:tc>
+          <w:tcPr>
+            <w:tcW w:type="dxa" w:w="1560"/>
+          </w:tcPr>
+          <w:p>
+            <w:r>
+              <w:t>Model</w:t>
+            </w:r>
+          </w:p>
+        </w:tc>
+        <w:tc>
+          <w:tcPr>
+            <w:tcW w:type="dxa" w:w="1560"/>
+          </w:tcPr>
+          <w:p>
+            <w:r>
+              <w:t>Condition</w:t>
+            </w:r>
+          </w:p>
+        </w:tc>
+        <w:tc>
+          <w:tcPr>
+            <w:tcW w:type="dxa" w:w="1560"/>
+          </w:tcPr>
+          <w:p>
+            <w:r>
+              <w:t>Errors</w:t>
+            </w:r>
+          </w:p>
+        </w:tc>
+        <w:tc>
+          <w:tcPr>
+            <w:tcW w:type="dxa" w:w="1560"/>
+          </w:tcPr>
+          <w:p>
+            <w:r>
+              <w:t>ITT Lower</w:t>
+            </w:r>
+          </w:p>
+        </w:tc>
+        <w:tc>
+          <w:tcPr>
+            <w:tcW w:type="dxa" w:w="1560"/>
+          </w:tcPr>
+          <w:p>
+            <w:r>
+              <w:t>ITT Upper</w:t>
+            </w:r>
+          </w:p>
+        </w:tc>
+        <w:tc>
+          <w:tcPr>
+            <w:tcW w:type="dxa" w:w="1560"/>
+          </w:tcPr>
+          <w:p>
+            <w:r>
+              <w:t>Per-Protocol</w:t>
+            </w:r>
+          </w:p>
+        </w:tc>
+      </w:tr>
+      <w:tr>
+        <w:tc>
+          <w:tcPr>
+            <w:tcW w:type="dxa" w:w="1560"/>
+          </w:tcPr>
+          <w:p>
+            <w:r>
+              <w:t>GPT-4.1 Nano</w:t>
+            </w:r>
+          </w:p>
+        </w:tc>
+        <w:tc>
+          <w:tcPr>
+            <w:tcW w:type="dxa" w:w="1560"/>
+          </w:tcPr>
+          <w:p>
+            <w:r>
+              <w:t>A</w:t>
+            </w:r>
+          </w:p>
+        </w:tc>
+        <w:tc>
+          <w:tcPr>
+            <w:tcW w:type="dxa" w:w="1560"/>
+          </w:tcPr>
+          <w:p>
+            <w:r>
+              <w:t>10 (1.1%)</w:t>
+            </w:r>
+          </w:p>
+        </w:tc>
+        <w:tc>
+          <w:tcPr>
+            <w:tcW w:type="dxa" w:w="1560"/>
+          </w:tcPr>
+          <w:p>
+            <w:r>
+              <w:t>76.6%</w:t>
+            </w:r>
+          </w:p>
+        </w:tc>
+        <w:tc>
+          <w:tcPr>
+            <w:tcW w:type="dxa" w:w="1560"/>
+          </w:tcPr>
+          <w:p>
+            <w:r>
+              <w:t>77.7%</w:t>
+            </w:r>
+          </w:p>
+        </w:tc>
+        <w:tc>
+          <w:tcPr>
+            <w:tcW w:type="dxa" w:w="1560"/>
+          </w:tcPr>
+          <w:p>
+            <w:r>
+              <w:t>77.4%</w:t>
+            </w:r>
+          </w:p>
+        </w:tc>
+      </w:tr>
+      <w:tr>
+        <w:tc>
+          <w:tcPr>
+            <w:tcW w:type="dxa" w:w="1560"/>
+          </w:tcPr>
+          <w:p>
+            <w:r>
+              <w:t>GPT-4.1 Nano</w:t>
+            </w:r>
+          </w:p>
+        </w:tc>
+        <w:tc>
+          <w:tcPr>
+            <w:tcW w:type="dxa" w:w="1560"/>
+          </w:tcPr>
+          <w:p>
+            <w:r>
+              <w:t>B</w:t>
+            </w:r>
+          </w:p>
+        </w:tc>
+        <w:tc>
+          <w:tcPr>
+            <w:tcW w:type="dxa" w:w="1560"/>
+          </w:tcPr>
+          <w:p>
+            <w:r>
+              <w:t>10 (1.1%)</w:t>
+            </w:r>
+          </w:p>
+        </w:tc>
+        <w:tc>
+          <w:tcPr>
+            <w:tcW w:type="dxa" w:w="1560"/>
+          </w:tcPr>
+          <w:p>
+            <w:r>
+              <w:t>82.7%</w:t>
+            </w:r>
+          </w:p>
+        </w:tc>
+        <w:tc>
+          <w:tcPr>
+            <w:tcW w:type="dxa" w:w="1560"/>
+          </w:tcPr>
+          <w:p>
+            <w:r>
+              <w:t>83.8%</w:t>
+            </w:r>
+          </w:p>
+        </w:tc>
+        <w:tc>
+          <w:tcPr>
+            <w:tcW w:type="dxa" w:w="1560"/>
+          </w:tcPr>
+          <w:p>
+            <w:r>
+              <w:t>83.7%</w:t>
+            </w:r>
+          </w:p>
+        </w:tc>
+      </w:tr>
+      <w:tr>
+        <w:tc>
+          <w:tcPr>
+            <w:tcW w:type="dxa" w:w="1560"/>
+          </w:tcPr>
+          <w:p>
+            <w:r>
+              <w:t>GPT-4.1 Nano</w:t>
+            </w:r>
+          </w:p>
+        </w:tc>
+        <w:tc>
+          <w:tcPr>
+            <w:tcW w:type="dxa" w:w="1560"/>
+          </w:tcPr>
+          <w:p>
+            <w:r>
+              <w:t>C</w:t>
+            </w:r>
+          </w:p>
+        </w:tc>
+        <w:tc>
+          <w:tcPr>
+            <w:tcW w:type="dxa" w:w="1560"/>
+          </w:tcPr>
+          <w:p>
+            <w:r>
+              <w:t>4 (2.8%)</w:t>
+            </w:r>
+          </w:p>
+        </w:tc>
+        <w:tc>
+          <w:tcPr>
+            <w:tcW w:type="dxa" w:w="1560"/>
+          </w:tcPr>
+          <w:p>
+            <w:r>
+              <w:t>60.5%</w:t>
+            </w:r>
+          </w:p>
+        </w:tc>
+        <w:tc>
+          <w:tcPr>
+            <w:tcW w:type="dxa" w:w="1560"/>
+          </w:tcPr>
+          <w:p>
+            <w:r>
+              <w:t>63.3%</w:t>
+            </w:r>
+          </w:p>
+        </w:tc>
+        <w:tc>
+          <w:tcPr>
+            <w:tcW w:type="dxa" w:w="1560"/>
+          </w:tcPr>
+          <w:p>
+            <w:r>
+              <w:t>62.2%</w:t>
+            </w:r>
+          </w:p>
+        </w:tc>
+      </w:tr>
+      <w:tr>
+        <w:tc>
+          <w:tcPr>
+            <w:tcW w:type="dxa" w:w="1560"/>
+          </w:tcPr>
+          <w:p>
+            <w:r>
+              <w:t>GPT-4.1 Nano</w:t>
+            </w:r>
+          </w:p>
+        </w:tc>
+        <w:tc>
+          <w:tcPr>
+            <w:tcW w:type="dxa" w:w="1560"/>
+          </w:tcPr>
+          <w:p>
+            <w:r>
+              <w:t>D</w:t>
+            </w:r>
+          </w:p>
+        </w:tc>
+        <w:tc>
+          <w:tcPr>
+            <w:tcW w:type="dxa" w:w="1560"/>
+          </w:tcPr>
+          <w:p>
+            <w:r>
+              <w:t>5 (3.4%)</w:t>
+            </w:r>
+          </w:p>
+        </w:tc>
+        <w:tc>
+          <w:tcPr>
+            <w:tcW w:type="dxa" w:w="1560"/>
+          </w:tcPr>
+          <w:p>
+            <w:r>
+              <w:t>72.4%</w:t>
+            </w:r>
+          </w:p>
+        </w:tc>
+        <w:tc>
+          <w:tcPr>
+            <w:tcW w:type="dxa" w:w="1560"/>
+          </w:tcPr>
+          <w:p>
+            <w:r>
+              <w:t>76.6%</w:t>
+            </w:r>
+          </w:p>
+        </w:tc>
+        <w:tc>
+          <w:tcPr>
+            <w:tcW w:type="dxa" w:w="1560"/>
+          </w:tcPr>
+          <w:p>
+            <w:r>
+              <w:t>75.2%</w:t>
+            </w:r>
+          </w:p>
+        </w:tc>
+      </w:tr>
+    </w:tbl>
+    <w:p>
+      <w:r>
+        <w:rPr>
+          <w:b/>
+          <w:sz w:val="18"/>
+        </w:rPr>
+        <w:t>Table N: Intent-to-treat (ITT) bounds and per-protocol accuracy.</w:t>
+      </w:r>
+    </w:p>
+    <w:tbl>
+      <w:tblPr>
+        <w:tblW w:type="auto" w:w="0"/>
+        <w:tblLook w:firstColumn="1" w:firstRow="1" w:lastColumn="0" w:lastRow="0" w:noHBand="0" w:noVBand="1" w:val="04A0"/>
+      </w:tblPr>
+      <w:tblGrid>
+        <w:gridCol w:w="1560"/>
+        <w:gridCol w:w="1560"/>
+        <w:gridCol w:w="1560"/>
+        <w:gridCol w:w="1560"/>
+        <w:gridCol w:w="1560"/>
+        <w:gridCol w:w="1560"/>
+      </w:tblGrid>
+      <w:tr>
+        <w:tc>
+          <w:tcPr>
+            <w:tcW w:type="dxa" w:w="1560"/>
+          </w:tcPr>
+          <w:p>
+            <w:r>
+              <w:t>Model</w:t>
+            </w:r>
+          </w:p>
+        </w:tc>
+        <w:tc>
+          <w:tcPr>
+            <w:tcW w:type="dxa" w:w="1560"/>
+          </w:tcPr>
+          <w:p>
+            <w:r>
+              <w:t>Condition</w:t>
+            </w:r>
+          </w:p>
+        </w:tc>
+        <w:tc>
+          <w:tcPr>
+            <w:tcW w:type="dxa" w:w="1560"/>
+          </w:tcPr>
+          <w:p>
+            <w:r>
+              <w:t>Obvious</w:t>
+            </w:r>
+          </w:p>
+        </w:tc>
+        <w:tc>
+          <w:tcPr>
+            <w:tcW w:type="dxa" w:w="1560"/>
+          </w:tcPr>
+          <w:p>
+            <w:r>
+              <w:t>Deceptive</w:t>
+            </w:r>
+          </w:p>
+        </w:tc>
+        <w:tc>
+          <w:tcPr>
+            <w:tcW w:type="dxa" w:w="1560"/>
+          </w:tcPr>
+          <w:p>
+            <w:r>
+              <w:t>Partial</w:t>
+            </w:r>
+          </w:p>
+        </w:tc>
+        <w:tc>
+          <w:tcPr>
+            <w:tcW w:type="dxa" w:w="1560"/>
+          </w:tcPr>
+          <w:p>
+            <w:r>
+              <w:t>Overall</w:t>
+            </w:r>
+          </w:p>
+        </w:tc>
+      </w:tr>
+      <w:tr>
+        <w:tc>
+          <w:tcPr>
+            <w:tcW w:type="dxa" w:w="1560"/>
+          </w:tcPr>
+          <w:p>
+            <w:r>
+              <w:t>GPT-4.1 Nano</w:t>
+            </w:r>
+          </w:p>
+        </w:tc>
+        <w:tc>
+          <w:tcPr>
+            <w:tcW w:type="dxa" w:w="1560"/>
+          </w:tcPr>
+          <w:p>
+            <w:r>
+              <w:t>A</w:t>
+            </w:r>
+          </w:p>
+        </w:tc>
+        <w:tc>
+          <w:tcPr>
+            <w:tcW w:type="dxa" w:w="1560"/>
+          </w:tcPr>
+          <w:p>
+            <w:r>
+              <w:t>76.5%</w:t>
+            </w:r>
+          </w:p>
+        </w:tc>
+        <w:tc>
+          <w:tcPr>
+            <w:tcW w:type="dxa" w:w="1560"/>
+          </w:tcPr>
+          <w:p>
+            <w:r>
+              <w:t>83.8%</w:t>
+            </w:r>
+          </w:p>
+        </w:tc>
+        <w:tc>
+          <w:tcPr>
+            <w:tcW w:type="dxa" w:w="1560"/>
+          </w:tcPr>
+          <w:p>
+            <w:r>
+              <w:t>93.6%</w:t>
+            </w:r>
+          </w:p>
+        </w:tc>
+        <w:tc>
+          <w:tcPr>
+            <w:tcW w:type="dxa" w:w="1560"/>
+          </w:tcPr>
+          <w:p>
+            <w:r>
+              <w:t>77.4%</w:t>
+            </w:r>
+          </w:p>
+        </w:tc>
+      </w:tr>
+      <w:tr>
+        <w:tc>
+          <w:tcPr>
+            <w:tcW w:type="dxa" w:w="1560"/>
+          </w:tcPr>
+          <w:p>
+            <w:r>
+              <w:t>GPT-4.1 Nano</w:t>
+            </w:r>
+          </w:p>
+        </w:tc>
+        <w:tc>
+          <w:tcPr>
+            <w:tcW w:type="dxa" w:w="1560"/>
+          </w:tcPr>
+          <w:p>
+            <w:r>
+              <w:t>B</w:t>
+            </w:r>
+          </w:p>
+        </w:tc>
+        <w:tc>
+          <w:tcPr>
+            <w:tcW w:type="dxa" w:w="1560"/>
+          </w:tcPr>
+          <w:p>
+            <w:r>
+              <w:t>83.0%</w:t>
+            </w:r>
+          </w:p>
+        </w:tc>
+        <w:tc>
+          <w:tcPr>
+            <w:tcW w:type="dxa" w:w="1560"/>
+          </w:tcPr>
+          <w:p>
+            <w:r>
+              <w:t>86.6%</w:t>
+            </w:r>
+          </w:p>
+        </w:tc>
+        <w:tc>
+          <w:tcPr>
+            <w:tcW w:type="dxa" w:w="1560"/>
+          </w:tcPr>
+          <w:p>
+            <w:r>
+              <w:t>94.3%</w:t>
+            </w:r>
+          </w:p>
+        </w:tc>
+        <w:tc>
+          <w:tcPr>
+            <w:tcW w:type="dxa" w:w="1560"/>
+          </w:tcPr>
+          <w:p>
+            <w:r>
+              <w:t>83.7%</w:t>
+            </w:r>
+          </w:p>
+        </w:tc>
+      </w:tr>
+      <w:tr>
+        <w:tc>
+          <w:tcPr>
+            <w:tcW w:type="dxa" w:w="1560"/>
+          </w:tcPr>
+          <w:p>
+            <w:r>
+              <w:t>GPT-4.1 Mini</w:t>
+            </w:r>
+          </w:p>
+        </w:tc>
+        <w:tc>
+          <w:tcPr>
+            <w:tcW w:type="dxa" w:w="1560"/>
+          </w:tcPr>
+          <w:p>
+            <w:r>
+              <w:t>A</w:t>
+            </w:r>
+          </w:p>
+        </w:tc>
+        <w:tc>
+          <w:tcPr>
+            <w:tcW w:type="dxa" w:w="1560"/>
+          </w:tcPr>
+          <w:p>
+            <w:r>
+              <w:t>82.4%</w:t>
+            </w:r>
+          </w:p>
+        </w:tc>
+        <w:tc>
+          <w:tcPr>
+            <w:tcW w:type="dxa" w:w="1560"/>
+          </w:tcPr>
+          <w:p>
+            <w:r>
+              <w:t>86.3%</w:t>
+            </w:r>
+          </w:p>
+        </w:tc>
+        <w:tc>
+          <w:tcPr>
+            <w:tcW w:type="dxa" w:w="1560"/>
+          </w:tcPr>
+          <w:p>
+            <w:r>
+              <w:t>94.3%</w:t>
+            </w:r>
+          </w:p>
+        </w:tc>
+        <w:tc>
+          <w:tcPr>
+            <w:tcW w:type="dxa" w:w="1560"/>
+          </w:tcPr>
+          <w:p>
+            <w:r>
+              <w:t>80.9%</w:t>
+            </w:r>
+          </w:p>
+        </w:tc>
+      </w:tr>
+      <w:tr>
+        <w:tc>
+          <w:tcPr>
+            <w:tcW w:type="dxa" w:w="1560"/>
+          </w:tcPr>
+          <w:p>
+            <w:r>
+              <w:t>GPT-4.1 Mini</w:t>
+            </w:r>
+          </w:p>
+        </w:tc>
+        <w:tc>
+          <w:tcPr>
+            <w:tcW w:type="dxa" w:w="1560"/>
+          </w:tcPr>
+          <w:p>
+            <w:r>
+              <w:t>B</w:t>
+            </w:r>
+          </w:p>
+        </w:tc>
+        <w:tc>
+          <w:tcPr>
+            <w:tcW w:type="dxa" w:w="1560"/>
+          </w:tcPr>
+          <w:p>
+            <w:r>
+              <w:t>88.9%</w:t>
+            </w:r>
+          </w:p>
+        </w:tc>
+        <w:tc>
+          <w:tcPr>
+            <w:tcW w:type="dxa" w:w="1560"/>
+          </w:tcPr>
+          <w:p>
+            <w:r>
+              <w:t>90.1%</w:t>
+            </w:r>
+          </w:p>
+        </w:tc>
+        <w:tc>
+          <w:tcPr>
+            <w:tcW w:type="dxa" w:w="1560"/>
+          </w:tcPr>
+          <w:p>
+            <w:r>
+              <w:t>95.6%</w:t>
+            </w:r>
+          </w:p>
+        </w:tc>
+        <w:tc>
+          <w:tcPr>
+            <w:tcW w:type="dxa" w:w="1560"/>
+          </w:tcPr>
+          <w:p>
+            <w:r>
+              <w:t>86.5%</w:t>
+            </w:r>
+          </w:p>
+        </w:tc>
+      </w:tr>
+    </w:tbl>
+    <w:p>
+      <w:r>
+        <w:rPr>
+          <w:b/>
+          <w:sz w:val="18"/>
+        </w:rPr>
+        <w:t>Table N: Verification accuracy by failure type.</w:t>
+      </w:r>
+    </w:p>
+    <w:tbl>
+      <w:tblPr>
+        <w:tblW w:type="auto" w:w="0"/>
+        <w:tblLook w:firstColumn="1" w:firstRow="1" w:lastColumn="0" w:lastRow="0" w:noHBand="0" w:noVBand="1" w:val="04A0"/>
+      </w:tblPr>
+      <w:tblGrid>
+        <w:gridCol w:w="1872"/>
+        <w:gridCol w:w="1872"/>
+        <w:gridCol w:w="1872"/>
+        <w:gridCol w:w="1872"/>
+        <w:gridCol w:w="1872"/>
+      </w:tblGrid>
+      <w:tr>
+        <w:tc>
+          <w:tcPr>
+            <w:tcW w:type="dxa" w:w="1872"/>
+          </w:tcPr>
+          <w:p>
+            <w:r>
+              <w:t>Model</w:t>
+            </w:r>
+          </w:p>
+        </w:tc>
+        <w:tc>
+          <w:tcPr>
+            <w:tcW w:type="dxa" w:w="1872"/>
+          </w:tcPr>
+          <w:p>
+            <w:r>
+              <w:t>Original</w:t>
+            </w:r>
+          </w:p>
+        </w:tc>
+        <w:tc>
+          <w:tcPr>
+            <w:tcW w:type="dxa" w:w="1872"/>
+          </w:tcPr>
+          <w:p>
+            <w:r>
+              <w:t>Short</w:t>
+            </w:r>
+          </w:p>
+        </w:tc>
+        <w:tc>
+          <w:tcPr>
+            <w:tcW w:type="dxa" w:w="1872"/>
+          </w:tcPr>
+          <w:p>
+            <w:r>
+              <w:t>Noisy</w:t>
+            </w:r>
+          </w:p>
+        </w:tc>
+        <w:tc>
+          <w:tcPr>
+            <w:tcW w:type="dxa" w:w="1872"/>
+          </w:tcPr>
+          <w:p>
+            <w:r>
+              <w:t>Wrong</w:t>
+            </w:r>
+          </w:p>
+        </w:tc>
+      </w:tr>
+      <w:tr>
+        <w:tc>
+          <w:tcPr>
+            <w:tcW w:type="dxa" w:w="1872"/>
+          </w:tcPr>
+          <w:p>
+            <w:r>
+              <w:t>GPT-4.1 Mini</w:t>
+            </w:r>
+          </w:p>
+        </w:tc>
+        <w:tc>
+          <w:tcPr>
+            <w:tcW w:type="dxa" w:w="1872"/>
+          </w:tcPr>
+          <w:p>
+            <w:r>
+              <w:t>86.5%</w:t>
+            </w:r>
+          </w:p>
+        </w:tc>
+        <w:tc>
+          <w:tcPr>
+            <w:tcW w:type="dxa" w:w="1872"/>
+          </w:tcPr>
+          <w:p>
+            <w:r>
+              <w:t>70.0%</w:t>
+            </w:r>
+          </w:p>
+        </w:tc>
+        <w:tc>
+          <w:tcPr>
+            <w:tcW w:type="dxa" w:w="1872"/>
+          </w:tcPr>
+          <w:p>
+            <w:r>
+              <w:t>70.0%</w:t>
+            </w:r>
+          </w:p>
+        </w:tc>
+        <w:tc>
+          <w:tcPr>
+            <w:tcW w:type="dxa" w:w="1872"/>
+          </w:tcPr>
+          <w:p>
+            <w:r>
+              <w:t>87.0%</w:t>
+            </w:r>
+          </w:p>
+        </w:tc>
+      </w:tr>
+      <w:tr>
+        <w:tc>
+          <w:tcPr>
+            <w:tcW w:type="dxa" w:w="1872"/>
+          </w:tcPr>
+          <w:p>
+            <w:r>
+              <w:t>Claude Sonnet 4</w:t>
+            </w:r>
+          </w:p>
+        </w:tc>
+        <w:tc>
+          <w:tcPr>
+            <w:tcW w:type="dxa" w:w="1872"/>
+          </w:tcPr>
+          <w:p>
+            <w:r>
+              <w:t>79.3%</w:t>
+            </w:r>
+          </w:p>
+        </w:tc>
+        <w:tc>
+          <w:tcPr>
+            <w:tcW w:type="dxa" w:w="1872"/>
+          </w:tcPr>
+          <w:p>
+            <w:r>
+              <w:t>77.0%</w:t>
+            </w:r>
+          </w:p>
+        </w:tc>
+        <w:tc>
+          <w:tcPr>
+            <w:tcW w:type="dxa" w:w="1872"/>
+          </w:tcPr>
+          <w:p>
+            <w:r>
+              <w:t>67.0%</w:t>
+            </w:r>
+          </w:p>
+        </w:tc>
+        <w:tc>
+          <w:tcPr>
+            <w:tcW w:type="dxa" w:w="1872"/>
+          </w:tcPr>
+          <w:p>
+            <w:r>
+              <w:t>N/A</w:t>
+            </w:r>
+          </w:p>
+        </w:tc>
+      </w:tr>
+    </w:tbl>
+    <w:p>
+      <w:r>
+        <w:rPr>
+          <w:b/>
+          <w:sz w:val="18"/>
+        </w:rPr>
+        <w:t>Table N: Text reference quality ablation.</w:t>
+      </w:r>
+    </w:p>
+    <w:tbl>
+      <w:tblPr>
+        <w:tblW w:type="auto" w:w="0"/>
+        <w:tblLook w:firstColumn="1" w:firstRow="1" w:lastColumn="0" w:lastRow="0" w:noHBand="0" w:noVBand="1" w:val="04A0"/>
+      </w:tblPr>
+      <w:tblGrid>
+        <w:gridCol w:w="2340"/>
+        <w:gridCol w:w="2340"/>
+        <w:gridCol w:w="2340"/>
+        <w:gridCol w:w="2340"/>
+      </w:tblGrid>
+      <w:tr>
+        <w:tc>
+          <w:tcPr>
+            <w:tcW w:type="dxa" w:w="2340"/>
+          </w:tcPr>
+          <w:p>
+            <w:r>
+              <w:t>Method</w:t>
+            </w:r>
+          </w:p>
+        </w:tc>
+        <w:tc>
+          <w:tcPr>
+            <w:tcW w:type="dxa" w:w="2340"/>
+          </w:tcPr>
+          <w:p>
+            <w:r>
+              <w:t>Accuracy</w:t>
+            </w:r>
+          </w:p>
+        </w:tc>
+        <w:tc>
+          <w:tcPr>
+            <w:tcW w:type="dxa" w:w="2340"/>
+          </w:tcPr>
+          <w:p>
+            <w:r>
+              <w:t>F1</w:t>
+            </w:r>
+          </w:p>
+        </w:tc>
+        <w:tc>
+          <w:tcPr>
+            <w:tcW w:type="dxa" w:w="2340"/>
+          </w:tcPr>
+          <w:p>
+            <w:r>
+              <w:t>FPR</w:t>
+            </w:r>
+          </w:p>
+        </w:tc>
+      </w:tr>
+      <w:tr>
+        <w:tc>
+          <w:tcPr>
+            <w:tcW w:type="dxa" w:w="2340"/>
+          </w:tcPr>
+          <w:p>
+            <w:r>
+              <w:t>pHash</w:t>
+            </w:r>
+          </w:p>
+        </w:tc>
+        <w:tc>
+          <w:tcPr>
+            <w:tcW w:type="dxa" w:w="2340"/>
+          </w:tcPr>
+          <w:p>
+            <w:r>
+              <w:t>69.4%</w:t>
+            </w:r>
+          </w:p>
+        </w:tc>
+        <w:tc>
+          <w:tcPr>
+            <w:tcW w:type="dxa" w:w="2340"/>
+          </w:tcPr>
+          <w:p>
+            <w:r>
+              <w:t>10.0%</w:t>
+            </w:r>
+          </w:p>
+        </w:tc>
+        <w:tc>
+          <w:tcPr>
+            <w:tcW w:type="dxa" w:w="2340"/>
+          </w:tcPr>
+          <w:p>
+            <w:r>
+              <w:t>19.2%</w:t>
+            </w:r>
+          </w:p>
+        </w:tc>
+      </w:tr>
+      <w:tr>
+        <w:tc>
+          <w:tcPr>
+            <w:tcW w:type="dxa" w:w="2340"/>
+          </w:tcPr>
+          <w:p>
+            <w:r>
+              <w:t>SSIM</w:t>
+            </w:r>
+          </w:p>
+        </w:tc>
+        <w:tc>
+          <w:tcPr>
+            <w:tcW w:type="dxa" w:w="2340"/>
+          </w:tcPr>
+          <w:p>
+            <w:r>
+              <w:t>23.6%</w:t>
+            </w:r>
+          </w:p>
+        </w:tc>
+        <w:tc>
+          <w:tcPr>
+            <w:tcW w:type="dxa" w:w="2340"/>
+          </w:tcPr>
+          <w:p>
+            <w:r>
+              <w:t>27.9%</w:t>
+            </w:r>
+          </w:p>
+        </w:tc>
+        <w:tc>
+          <w:tcPr>
+            <w:tcW w:type="dxa" w:w="2340"/>
+          </w:tcPr>
+          <w:p>
+            <w:r>
+              <w:t>89.5%</w:t>
+            </w:r>
+          </w:p>
+        </w:tc>
+      </w:tr>
+      <w:tr>
+        <w:tc>
+          <w:tcPr>
+            <w:tcW w:type="dxa" w:w="2340"/>
+          </w:tcPr>
+          <w:p>
+            <w:r>
+              <w:t>GPT-4.1 Nano (A)</w:t>
+            </w:r>
+          </w:p>
+        </w:tc>
+        <w:tc>
+          <w:tcPr>
+            <w:tcW w:type="dxa" w:w="2340"/>
+          </w:tcPr>
+          <w:p>
+            <w:r>
+              <w:t>77.4%</w:t>
+            </w:r>
+          </w:p>
+        </w:tc>
+        <w:tc>
+          <w:tcPr>
+            <w:tcW w:type="dxa" w:w="2340"/>
+          </w:tcPr>
+          <w:p>
+            <w:r>
+              <w:t>32.6%</w:t>
+            </w:r>
+          </w:p>
+        </w:tc>
+        <w:tc>
+          <w:tcPr>
+            <w:tcW w:type="dxa" w:w="2340"/>
+          </w:tcPr>
+          <w:p>
+            <w:r>
+              <w:t>13.6%</w:t>
+            </w:r>
+          </w:p>
+        </w:tc>
+      </w:tr>
+      <w:tr>
+        <w:tc>
+          <w:tcPr>
+            <w:tcW w:type="dxa" w:w="2340"/>
+          </w:tcPr>
+          <w:p>
+            <w:r>
+              <w:t>GPT-4.1 Nano (B)</w:t>
+            </w:r>
+          </w:p>
+        </w:tc>
+        <w:tc>
+          <w:tcPr>
+            <w:tcW w:type="dxa" w:w="2340"/>
+          </w:tcPr>
+          <w:p>
+            <w:r>
+              <w:t>83.7%</w:t>
+            </w:r>
+          </w:p>
+        </w:tc>
+        <w:tc>
+          <w:tcPr>
+            <w:tcW w:type="dxa" w:w="2340"/>
+          </w:tcPr>
+          <w:p>
+            <w:r>
+              <w:t>48.8%</w:t>
+            </w:r>
+          </w:p>
+        </w:tc>
+        <w:tc>
+          <w:tcPr>
+            <w:tcW w:type="dxa" w:w="2340"/>
+          </w:tcPr>
+          <w:p>
+            <w:r>
+              <w:t>9.1%</w:t>
+            </w:r>
+          </w:p>
+        </w:tc>
+      </w:tr>
+    </w:tbl>
+    <w:p>
+      <w:r>
+        <w:rPr>
+          <w:b/>
+          <w:sz w:val="18"/>
+        </w:rPr>
+        <w:t>Table N: Non-LLM baseline comparison.</w:t>
       </w:r>
     </w:p>
     <w:sectPr>

</xml_diff>

<commit_message>
Insert all 5 new tables at correct positions in manuscript
</commit_message>
<xml_diff>
--- a/manuscripts/can_llm_web_agents_verify_their_own_work_revised.docx
+++ b/manuscripts/can_llm_web_agents_verify_their_own_work_revised.docx
@@ -2429,9 +2429,9 @@
           <w:szCs w:val="20"/>
           <w:rtl w:val="0"/>
         </w:rPr>
-        <w:br/>
-        <w:t>Figure 1: Visual Post-Hoc Verification Framework, inputs, prompt construction, and outputs for each of the four conditions (A–D).</w:t>
-        <w:br/>
+        <w:br w:type="textWrapping"/>
+        <w:t xml:space="preserve">Figure 1: Visual Self-Verification Framework, inputs, prompt construction, and outputs for each of the four conditions (A–D).</w:t>
+        <w:br w:type="textWrapping"/>
       </w:r>
     </w:p>
     <w:p>
@@ -13120,6 +13120,340 @@
         </w:tc>
       </w:tr>
     </w:tbl>
+    <w:p>
+      <w:r>
+        <w:t>Table 6: Cross-model text reference verification results. The A→B lift largely disappears when using independently generated references.</w:t>
+      </w:r>
+    </w:p>
+    <w:tbl>
+      <w:tblPr>
+        <w:tblW w:type="auto" w:w="0"/>
+        <w:tblLook w:firstColumn="1" w:firstRow="1" w:lastColumn="0" w:lastRow="0" w:noHBand="0" w:noVBand="1" w:val="04A0"/>
+      </w:tblPr>
+      <w:tblGrid>
+        <w:gridCol w:w="1560"/>
+        <w:gridCol w:w="1560"/>
+        <w:gridCol w:w="1560"/>
+        <w:gridCol w:w="1560"/>
+        <w:gridCol w:w="1560"/>
+        <w:gridCol w:w="1560"/>
+      </w:tblGrid>
+      <w:tr>
+        <w:tc>
+          <w:tcPr>
+            <w:tcW w:type="dxa" w:w="1560"/>
+          </w:tcPr>
+          <w:p>
+            <w:r>
+              <w:t>Model</w:t>
+            </w:r>
+          </w:p>
+        </w:tc>
+        <w:tc>
+          <w:tcPr>
+            <w:tcW w:type="dxa" w:w="1560"/>
+          </w:tcPr>
+          <w:p>
+            <w:r>
+              <w:t>Condition</w:t>
+            </w:r>
+          </w:p>
+        </w:tc>
+        <w:tc>
+          <w:tcPr>
+            <w:tcW w:type="dxa" w:w="1560"/>
+          </w:tcPr>
+          <w:p>
+            <w:r>
+              <w:t>Errors</w:t>
+            </w:r>
+          </w:p>
+        </w:tc>
+        <w:tc>
+          <w:tcPr>
+            <w:tcW w:type="dxa" w:w="1560"/>
+          </w:tcPr>
+          <w:p>
+            <w:r>
+              <w:t>ITT Lower</w:t>
+            </w:r>
+          </w:p>
+        </w:tc>
+        <w:tc>
+          <w:tcPr>
+            <w:tcW w:type="dxa" w:w="1560"/>
+          </w:tcPr>
+          <w:p>
+            <w:r>
+              <w:t>ITT Upper</w:t>
+            </w:r>
+          </w:p>
+        </w:tc>
+        <w:tc>
+          <w:tcPr>
+            <w:tcW w:type="dxa" w:w="1560"/>
+          </w:tcPr>
+          <w:p>
+            <w:r>
+              <w:t>Per-Protocol</w:t>
+            </w:r>
+          </w:p>
+        </w:tc>
+      </w:tr>
+      <w:tr>
+        <w:tc>
+          <w:tcPr>
+            <w:tcW w:type="dxa" w:w="1560"/>
+          </w:tcPr>
+          <w:p>
+            <w:r>
+              <w:t>GPT-4.1 Nano</w:t>
+            </w:r>
+          </w:p>
+        </w:tc>
+        <w:tc>
+          <w:tcPr>
+            <w:tcW w:type="dxa" w:w="1560"/>
+          </w:tcPr>
+          <w:p>
+            <w:r>
+              <w:t>A</w:t>
+            </w:r>
+          </w:p>
+        </w:tc>
+        <w:tc>
+          <w:tcPr>
+            <w:tcW w:type="dxa" w:w="1560"/>
+          </w:tcPr>
+          <w:p>
+            <w:r>
+              <w:t>10 (1.1%)</w:t>
+            </w:r>
+          </w:p>
+        </w:tc>
+        <w:tc>
+          <w:tcPr>
+            <w:tcW w:type="dxa" w:w="1560"/>
+          </w:tcPr>
+          <w:p>
+            <w:r>
+              <w:t>76.6%</w:t>
+            </w:r>
+          </w:p>
+        </w:tc>
+        <w:tc>
+          <w:tcPr>
+            <w:tcW w:type="dxa" w:w="1560"/>
+          </w:tcPr>
+          <w:p>
+            <w:r>
+              <w:t>77.7%</w:t>
+            </w:r>
+          </w:p>
+        </w:tc>
+        <w:tc>
+          <w:tcPr>
+            <w:tcW w:type="dxa" w:w="1560"/>
+          </w:tcPr>
+          <w:p>
+            <w:r>
+              <w:t>77.4%</w:t>
+            </w:r>
+          </w:p>
+        </w:tc>
+      </w:tr>
+      <w:tr>
+        <w:tc>
+          <w:tcPr>
+            <w:tcW w:type="dxa" w:w="1560"/>
+          </w:tcPr>
+          <w:p>
+            <w:r>
+              <w:t>GPT-4.1 Nano</w:t>
+            </w:r>
+          </w:p>
+        </w:tc>
+        <w:tc>
+          <w:tcPr>
+            <w:tcW w:type="dxa" w:w="1560"/>
+          </w:tcPr>
+          <w:p>
+            <w:r>
+              <w:t>B</w:t>
+            </w:r>
+          </w:p>
+        </w:tc>
+        <w:tc>
+          <w:tcPr>
+            <w:tcW w:type="dxa" w:w="1560"/>
+          </w:tcPr>
+          <w:p>
+            <w:r>
+              <w:t>10 (1.1%)</w:t>
+            </w:r>
+          </w:p>
+        </w:tc>
+        <w:tc>
+          <w:tcPr>
+            <w:tcW w:type="dxa" w:w="1560"/>
+          </w:tcPr>
+          <w:p>
+            <w:r>
+              <w:t>82.7%</w:t>
+            </w:r>
+          </w:p>
+        </w:tc>
+        <w:tc>
+          <w:tcPr>
+            <w:tcW w:type="dxa" w:w="1560"/>
+          </w:tcPr>
+          <w:p>
+            <w:r>
+              <w:t>83.8%</w:t>
+            </w:r>
+          </w:p>
+        </w:tc>
+        <w:tc>
+          <w:tcPr>
+            <w:tcW w:type="dxa" w:w="1560"/>
+          </w:tcPr>
+          <w:p>
+            <w:r>
+              <w:t>83.7%</w:t>
+            </w:r>
+          </w:p>
+        </w:tc>
+      </w:tr>
+      <w:tr>
+        <w:tc>
+          <w:tcPr>
+            <w:tcW w:type="dxa" w:w="1560"/>
+          </w:tcPr>
+          <w:p>
+            <w:r>
+              <w:t>GPT-4.1 Nano</w:t>
+            </w:r>
+          </w:p>
+        </w:tc>
+        <w:tc>
+          <w:tcPr>
+            <w:tcW w:type="dxa" w:w="1560"/>
+          </w:tcPr>
+          <w:p>
+            <w:r>
+              <w:t>C</w:t>
+            </w:r>
+          </w:p>
+        </w:tc>
+        <w:tc>
+          <w:tcPr>
+            <w:tcW w:type="dxa" w:w="1560"/>
+          </w:tcPr>
+          <w:p>
+            <w:r>
+              <w:t>4 (2.8%)</w:t>
+            </w:r>
+          </w:p>
+        </w:tc>
+        <w:tc>
+          <w:tcPr>
+            <w:tcW w:type="dxa" w:w="1560"/>
+          </w:tcPr>
+          <w:p>
+            <w:r>
+              <w:t>60.5%</w:t>
+            </w:r>
+          </w:p>
+        </w:tc>
+        <w:tc>
+          <w:tcPr>
+            <w:tcW w:type="dxa" w:w="1560"/>
+          </w:tcPr>
+          <w:p>
+            <w:r>
+              <w:t>63.3%</w:t>
+            </w:r>
+          </w:p>
+        </w:tc>
+        <w:tc>
+          <w:tcPr>
+            <w:tcW w:type="dxa" w:w="1560"/>
+          </w:tcPr>
+          <w:p>
+            <w:r>
+              <w:t>62.2%</w:t>
+            </w:r>
+          </w:p>
+        </w:tc>
+      </w:tr>
+      <w:tr>
+        <w:tc>
+          <w:tcPr>
+            <w:tcW w:type="dxa" w:w="1560"/>
+          </w:tcPr>
+          <w:p>
+            <w:r>
+              <w:t>GPT-4.1 Nano</w:t>
+            </w:r>
+          </w:p>
+        </w:tc>
+        <w:tc>
+          <w:tcPr>
+            <w:tcW w:type="dxa" w:w="1560"/>
+          </w:tcPr>
+          <w:p>
+            <w:r>
+              <w:t>D</w:t>
+            </w:r>
+          </w:p>
+        </w:tc>
+        <w:tc>
+          <w:tcPr>
+            <w:tcW w:type="dxa" w:w="1560"/>
+          </w:tcPr>
+          <w:p>
+            <w:r>
+              <w:t>5 (3.4%)</w:t>
+            </w:r>
+          </w:p>
+        </w:tc>
+        <w:tc>
+          <w:tcPr>
+            <w:tcW w:type="dxa" w:w="1560"/>
+          </w:tcPr>
+          <w:p>
+            <w:r>
+              <w:t>72.4%</w:t>
+            </w:r>
+          </w:p>
+        </w:tc>
+        <w:tc>
+          <w:tcPr>
+            <w:tcW w:type="dxa" w:w="1560"/>
+          </w:tcPr>
+          <w:p>
+            <w:r>
+              <w:t>76.6%</w:t>
+            </w:r>
+          </w:p>
+        </w:tc>
+        <w:tc>
+          <w:tcPr>
+            <w:tcW w:type="dxa" w:w="1560"/>
+          </w:tcPr>
+          <w:p>
+            <w:r>
+              <w:t>75.2%</w:t>
+            </w:r>
+          </w:p>
+        </w:tc>
+      </w:tr>
+    </w:tbl>
+    <w:p>
+      <w:r>
+        <w:t>Table 7: Intent-to-treat (ITT) bounds and per-protocol accuracy.</w:t>
+      </w:r>
+    </w:p>
     <w:p>
       <w:pPr>
         <w:jc w:val="both"/>
@@ -15065,6 +15399,335 @@
     </w:p>
     <w:tbl>
       <w:tblPr>
+        <w:tblW w:type="auto" w:w="0"/>
+        <w:tblLook w:firstColumn="1" w:firstRow="1" w:lastColumn="0" w:lastRow="0" w:noHBand="0" w:noVBand="1" w:val="04A0"/>
+      </w:tblPr>
+      <w:tblGrid>
+        <w:gridCol w:w="1560"/>
+        <w:gridCol w:w="1560"/>
+        <w:gridCol w:w="1560"/>
+        <w:gridCol w:w="1560"/>
+        <w:gridCol w:w="1560"/>
+        <w:gridCol w:w="1560"/>
+      </w:tblGrid>
+      <w:tr>
+        <w:tc>
+          <w:tcPr>
+            <w:tcW w:type="dxa" w:w="1560"/>
+          </w:tcPr>
+          <w:p>
+            <w:r>
+              <w:t>Model</w:t>
+            </w:r>
+          </w:p>
+        </w:tc>
+        <w:tc>
+          <w:tcPr>
+            <w:tcW w:type="dxa" w:w="1560"/>
+          </w:tcPr>
+          <w:p>
+            <w:r>
+              <w:t>Condition</w:t>
+            </w:r>
+          </w:p>
+        </w:tc>
+        <w:tc>
+          <w:tcPr>
+            <w:tcW w:type="dxa" w:w="1560"/>
+          </w:tcPr>
+          <w:p>
+            <w:r>
+              <w:t>Obvious</w:t>
+            </w:r>
+          </w:p>
+        </w:tc>
+        <w:tc>
+          <w:tcPr>
+            <w:tcW w:type="dxa" w:w="1560"/>
+          </w:tcPr>
+          <w:p>
+            <w:r>
+              <w:t>Deceptive</w:t>
+            </w:r>
+          </w:p>
+        </w:tc>
+        <w:tc>
+          <w:tcPr>
+            <w:tcW w:type="dxa" w:w="1560"/>
+          </w:tcPr>
+          <w:p>
+            <w:r>
+              <w:t>Partial</w:t>
+            </w:r>
+          </w:p>
+        </w:tc>
+        <w:tc>
+          <w:tcPr>
+            <w:tcW w:type="dxa" w:w="1560"/>
+          </w:tcPr>
+          <w:p>
+            <w:r>
+              <w:t>Overall</w:t>
+            </w:r>
+          </w:p>
+        </w:tc>
+      </w:tr>
+      <w:tr>
+        <w:tc>
+          <w:tcPr>
+            <w:tcW w:type="dxa" w:w="1560"/>
+          </w:tcPr>
+          <w:p>
+            <w:r>
+              <w:t>GPT-4.1 Nano</w:t>
+            </w:r>
+          </w:p>
+        </w:tc>
+        <w:tc>
+          <w:tcPr>
+            <w:tcW w:type="dxa" w:w="1560"/>
+          </w:tcPr>
+          <w:p>
+            <w:r>
+              <w:t>A</w:t>
+            </w:r>
+          </w:p>
+        </w:tc>
+        <w:tc>
+          <w:tcPr>
+            <w:tcW w:type="dxa" w:w="1560"/>
+          </w:tcPr>
+          <w:p>
+            <w:r>
+              <w:t>76.5%</w:t>
+            </w:r>
+          </w:p>
+        </w:tc>
+        <w:tc>
+          <w:tcPr>
+            <w:tcW w:type="dxa" w:w="1560"/>
+          </w:tcPr>
+          <w:p>
+            <w:r>
+              <w:t>83.8%</w:t>
+            </w:r>
+          </w:p>
+        </w:tc>
+        <w:tc>
+          <w:tcPr>
+            <w:tcW w:type="dxa" w:w="1560"/>
+          </w:tcPr>
+          <w:p>
+            <w:r>
+              <w:t>93.6%</w:t>
+            </w:r>
+          </w:p>
+        </w:tc>
+        <w:tc>
+          <w:tcPr>
+            <w:tcW w:type="dxa" w:w="1560"/>
+          </w:tcPr>
+          <w:p>
+            <w:r>
+              <w:t>77.4%</w:t>
+            </w:r>
+          </w:p>
+        </w:tc>
+      </w:tr>
+      <w:tr>
+        <w:tc>
+          <w:tcPr>
+            <w:tcW w:type="dxa" w:w="1560"/>
+          </w:tcPr>
+          <w:p>
+            <w:r>
+              <w:t>GPT-4.1 Nano</w:t>
+            </w:r>
+          </w:p>
+        </w:tc>
+        <w:tc>
+          <w:tcPr>
+            <w:tcW w:type="dxa" w:w="1560"/>
+          </w:tcPr>
+          <w:p>
+            <w:r>
+              <w:t>B</w:t>
+            </w:r>
+          </w:p>
+        </w:tc>
+        <w:tc>
+          <w:tcPr>
+            <w:tcW w:type="dxa" w:w="1560"/>
+          </w:tcPr>
+          <w:p>
+            <w:r>
+              <w:t>83.0%</w:t>
+            </w:r>
+          </w:p>
+        </w:tc>
+        <w:tc>
+          <w:tcPr>
+            <w:tcW w:type="dxa" w:w="1560"/>
+          </w:tcPr>
+          <w:p>
+            <w:r>
+              <w:t>86.6%</w:t>
+            </w:r>
+          </w:p>
+        </w:tc>
+        <w:tc>
+          <w:tcPr>
+            <w:tcW w:type="dxa" w:w="1560"/>
+          </w:tcPr>
+          <w:p>
+            <w:r>
+              <w:t>94.3%</w:t>
+            </w:r>
+          </w:p>
+        </w:tc>
+        <w:tc>
+          <w:tcPr>
+            <w:tcW w:type="dxa" w:w="1560"/>
+          </w:tcPr>
+          <w:p>
+            <w:r>
+              <w:t>83.7%</w:t>
+            </w:r>
+          </w:p>
+        </w:tc>
+      </w:tr>
+      <w:tr>
+        <w:tc>
+          <w:tcPr>
+            <w:tcW w:type="dxa" w:w="1560"/>
+          </w:tcPr>
+          <w:p>
+            <w:r>
+              <w:t>GPT-4.1 Mini</w:t>
+            </w:r>
+          </w:p>
+        </w:tc>
+        <w:tc>
+          <w:tcPr>
+            <w:tcW w:type="dxa" w:w="1560"/>
+          </w:tcPr>
+          <w:p>
+            <w:r>
+              <w:t>A</w:t>
+            </w:r>
+          </w:p>
+        </w:tc>
+        <w:tc>
+          <w:tcPr>
+            <w:tcW w:type="dxa" w:w="1560"/>
+          </w:tcPr>
+          <w:p>
+            <w:r>
+              <w:t>82.4%</w:t>
+            </w:r>
+          </w:p>
+        </w:tc>
+        <w:tc>
+          <w:tcPr>
+            <w:tcW w:type="dxa" w:w="1560"/>
+          </w:tcPr>
+          <w:p>
+            <w:r>
+              <w:t>86.3%</w:t>
+            </w:r>
+          </w:p>
+        </w:tc>
+        <w:tc>
+          <w:tcPr>
+            <w:tcW w:type="dxa" w:w="1560"/>
+          </w:tcPr>
+          <w:p>
+            <w:r>
+              <w:t>94.3%</w:t>
+            </w:r>
+          </w:p>
+        </w:tc>
+        <w:tc>
+          <w:tcPr>
+            <w:tcW w:type="dxa" w:w="1560"/>
+          </w:tcPr>
+          <w:p>
+            <w:r>
+              <w:t>80.9%</w:t>
+            </w:r>
+          </w:p>
+        </w:tc>
+      </w:tr>
+      <w:tr>
+        <w:tc>
+          <w:tcPr>
+            <w:tcW w:type="dxa" w:w="1560"/>
+          </w:tcPr>
+          <w:p>
+            <w:r>
+              <w:t>GPT-4.1 Mini</w:t>
+            </w:r>
+          </w:p>
+        </w:tc>
+        <w:tc>
+          <w:tcPr>
+            <w:tcW w:type="dxa" w:w="1560"/>
+          </w:tcPr>
+          <w:p>
+            <w:r>
+              <w:t>B</w:t>
+            </w:r>
+          </w:p>
+        </w:tc>
+        <w:tc>
+          <w:tcPr>
+            <w:tcW w:type="dxa" w:w="1560"/>
+          </w:tcPr>
+          <w:p>
+            <w:r>
+              <w:t>88.9%</w:t>
+            </w:r>
+          </w:p>
+        </w:tc>
+        <w:tc>
+          <w:tcPr>
+            <w:tcW w:type="dxa" w:w="1560"/>
+          </w:tcPr>
+          <w:p>
+            <w:r>
+              <w:t>90.1%</w:t>
+            </w:r>
+          </w:p>
+        </w:tc>
+        <w:tc>
+          <w:tcPr>
+            <w:tcW w:type="dxa" w:w="1560"/>
+          </w:tcPr>
+          <w:p>
+            <w:r>
+              <w:t>95.6%</w:t>
+            </w:r>
+          </w:p>
+        </w:tc>
+        <w:tc>
+          <w:tcPr>
+            <w:tcW w:type="dxa" w:w="1560"/>
+          </w:tcPr>
+          <w:p>
+            <w:r>
+              <w:t>86.5%</w:t>
+            </w:r>
+          </w:p>
+        </w:tc>
+      </w:tr>
+    </w:tbl>
+    <w:p>
+      <w:r>
+        <w:t>Table 8: Verification accuracy by failure type.</w:t>
+      </w:r>
+    </w:p>
+    <w:tbl>
+      <w:tblPr>
         <w:tblStyle w:val="Table7"/>
         <w:tblW w:w="4320.0" w:type="dxa"/>
         <w:jc w:val="center"/>
@@ -17167,6 +17830,407 @@
         </w:rPr>
       </w:r>
     </w:p>
+    <w:tbl>
+      <w:tblPr>
+        <w:tblW w:type="auto" w:w="0"/>
+        <w:tblLook w:firstColumn="1" w:firstRow="1" w:lastColumn="0" w:lastRow="0" w:noHBand="0" w:noVBand="1" w:val="04A0"/>
+      </w:tblPr>
+      <w:tblGrid>
+        <w:gridCol w:w="2340"/>
+        <w:gridCol w:w="2340"/>
+        <w:gridCol w:w="2340"/>
+        <w:gridCol w:w="2340"/>
+      </w:tblGrid>
+      <w:tr>
+        <w:tc>
+          <w:tcPr>
+            <w:tcW w:type="dxa" w:w="2340"/>
+          </w:tcPr>
+          <w:p>
+            <w:r>
+              <w:t>Method</w:t>
+            </w:r>
+          </w:p>
+        </w:tc>
+        <w:tc>
+          <w:tcPr>
+            <w:tcW w:type="dxa" w:w="2340"/>
+          </w:tcPr>
+          <w:p>
+            <w:r>
+              <w:t>Accuracy</w:t>
+            </w:r>
+          </w:p>
+        </w:tc>
+        <w:tc>
+          <w:tcPr>
+            <w:tcW w:type="dxa" w:w="2340"/>
+          </w:tcPr>
+          <w:p>
+            <w:r>
+              <w:t>F1</w:t>
+            </w:r>
+          </w:p>
+        </w:tc>
+        <w:tc>
+          <w:tcPr>
+            <w:tcW w:type="dxa" w:w="2340"/>
+          </w:tcPr>
+          <w:p>
+            <w:r>
+              <w:t>FPR</w:t>
+            </w:r>
+          </w:p>
+        </w:tc>
+      </w:tr>
+      <w:tr>
+        <w:tc>
+          <w:tcPr>
+            <w:tcW w:type="dxa" w:w="2340"/>
+          </w:tcPr>
+          <w:p>
+            <w:r>
+              <w:t>pHash</w:t>
+            </w:r>
+          </w:p>
+        </w:tc>
+        <w:tc>
+          <w:tcPr>
+            <w:tcW w:type="dxa" w:w="2340"/>
+          </w:tcPr>
+          <w:p>
+            <w:r>
+              <w:t>69.4%</w:t>
+            </w:r>
+          </w:p>
+        </w:tc>
+        <w:tc>
+          <w:tcPr>
+            <w:tcW w:type="dxa" w:w="2340"/>
+          </w:tcPr>
+          <w:p>
+            <w:r>
+              <w:t>10.0%</w:t>
+            </w:r>
+          </w:p>
+        </w:tc>
+        <w:tc>
+          <w:tcPr>
+            <w:tcW w:type="dxa" w:w="2340"/>
+          </w:tcPr>
+          <w:p>
+            <w:r>
+              <w:t>19.2%</w:t>
+            </w:r>
+          </w:p>
+        </w:tc>
+      </w:tr>
+      <w:tr>
+        <w:tc>
+          <w:tcPr>
+            <w:tcW w:type="dxa" w:w="2340"/>
+          </w:tcPr>
+          <w:p>
+            <w:r>
+              <w:t>SSIM</w:t>
+            </w:r>
+          </w:p>
+        </w:tc>
+        <w:tc>
+          <w:tcPr>
+            <w:tcW w:type="dxa" w:w="2340"/>
+          </w:tcPr>
+          <w:p>
+            <w:r>
+              <w:t>23.6%</w:t>
+            </w:r>
+          </w:p>
+        </w:tc>
+        <w:tc>
+          <w:tcPr>
+            <w:tcW w:type="dxa" w:w="2340"/>
+          </w:tcPr>
+          <w:p>
+            <w:r>
+              <w:t>27.9%</w:t>
+            </w:r>
+          </w:p>
+        </w:tc>
+        <w:tc>
+          <w:tcPr>
+            <w:tcW w:type="dxa" w:w="2340"/>
+          </w:tcPr>
+          <w:p>
+            <w:r>
+              <w:t>89.5%</w:t>
+            </w:r>
+          </w:p>
+        </w:tc>
+      </w:tr>
+      <w:tr>
+        <w:tc>
+          <w:tcPr>
+            <w:tcW w:type="dxa" w:w="2340"/>
+          </w:tcPr>
+          <w:p>
+            <w:r>
+              <w:t>GPT-4.1 Nano (A)</w:t>
+            </w:r>
+          </w:p>
+        </w:tc>
+        <w:tc>
+          <w:tcPr>
+            <w:tcW w:type="dxa" w:w="2340"/>
+          </w:tcPr>
+          <w:p>
+            <w:r>
+              <w:t>77.4%</w:t>
+            </w:r>
+          </w:p>
+        </w:tc>
+        <w:tc>
+          <w:tcPr>
+            <w:tcW w:type="dxa" w:w="2340"/>
+          </w:tcPr>
+          <w:p>
+            <w:r>
+              <w:t>32.6%</w:t>
+            </w:r>
+          </w:p>
+        </w:tc>
+        <w:tc>
+          <w:tcPr>
+            <w:tcW w:type="dxa" w:w="2340"/>
+          </w:tcPr>
+          <w:p>
+            <w:r>
+              <w:t>13.6%</w:t>
+            </w:r>
+          </w:p>
+        </w:tc>
+      </w:tr>
+      <w:tr>
+        <w:tc>
+          <w:tcPr>
+            <w:tcW w:type="dxa" w:w="2340"/>
+          </w:tcPr>
+          <w:p>
+            <w:r>
+              <w:t>GPT-4.1 Nano (B)</w:t>
+            </w:r>
+          </w:p>
+        </w:tc>
+        <w:tc>
+          <w:tcPr>
+            <w:tcW w:type="dxa" w:w="2340"/>
+          </w:tcPr>
+          <w:p>
+            <w:r>
+              <w:t>83.7%</w:t>
+            </w:r>
+          </w:p>
+        </w:tc>
+        <w:tc>
+          <w:tcPr>
+            <w:tcW w:type="dxa" w:w="2340"/>
+          </w:tcPr>
+          <w:p>
+            <w:r>
+              <w:t>48.8%</w:t>
+            </w:r>
+          </w:p>
+        </w:tc>
+        <w:tc>
+          <w:tcPr>
+            <w:tcW w:type="dxa" w:w="2340"/>
+          </w:tcPr>
+          <w:p>
+            <w:r>
+              <w:t>9.1%</w:t>
+            </w:r>
+          </w:p>
+        </w:tc>
+      </w:tr>
+    </w:tbl>
+    <w:p>
+      <w:r>
+        <w:t>Table 10: Non-LLM baseline comparison.</w:t>
+      </w:r>
+    </w:p>
+    <w:tbl>
+      <w:tblPr>
+        <w:tblW w:type="auto" w:w="0"/>
+        <w:tblLook w:firstColumn="1" w:firstRow="1" w:lastColumn="0" w:lastRow="0" w:noHBand="0" w:noVBand="1" w:val="04A0"/>
+      </w:tblPr>
+      <w:tblGrid>
+        <w:gridCol w:w="1872"/>
+        <w:gridCol w:w="1872"/>
+        <w:gridCol w:w="1872"/>
+        <w:gridCol w:w="1872"/>
+        <w:gridCol w:w="1872"/>
+      </w:tblGrid>
+      <w:tr>
+        <w:tc>
+          <w:tcPr>
+            <w:tcW w:type="dxa" w:w="1872"/>
+          </w:tcPr>
+          <w:p>
+            <w:r>
+              <w:t>Model</w:t>
+            </w:r>
+          </w:p>
+        </w:tc>
+        <w:tc>
+          <w:tcPr>
+            <w:tcW w:type="dxa" w:w="1872"/>
+          </w:tcPr>
+          <w:p>
+            <w:r>
+              <w:t>Original</w:t>
+            </w:r>
+          </w:p>
+        </w:tc>
+        <w:tc>
+          <w:tcPr>
+            <w:tcW w:type="dxa" w:w="1872"/>
+          </w:tcPr>
+          <w:p>
+            <w:r>
+              <w:t>Short</w:t>
+            </w:r>
+          </w:p>
+        </w:tc>
+        <w:tc>
+          <w:tcPr>
+            <w:tcW w:type="dxa" w:w="1872"/>
+          </w:tcPr>
+          <w:p>
+            <w:r>
+              <w:t>Noisy</w:t>
+            </w:r>
+          </w:p>
+        </w:tc>
+        <w:tc>
+          <w:tcPr>
+            <w:tcW w:type="dxa" w:w="1872"/>
+          </w:tcPr>
+          <w:p>
+            <w:r>
+              <w:t>Wrong</w:t>
+            </w:r>
+          </w:p>
+        </w:tc>
+      </w:tr>
+      <w:tr>
+        <w:tc>
+          <w:tcPr>
+            <w:tcW w:type="dxa" w:w="1872"/>
+          </w:tcPr>
+          <w:p>
+            <w:r>
+              <w:t>GPT-4.1 Mini</w:t>
+            </w:r>
+          </w:p>
+        </w:tc>
+        <w:tc>
+          <w:tcPr>
+            <w:tcW w:type="dxa" w:w="1872"/>
+          </w:tcPr>
+          <w:p>
+            <w:r>
+              <w:t>86.5%</w:t>
+            </w:r>
+          </w:p>
+        </w:tc>
+        <w:tc>
+          <w:tcPr>
+            <w:tcW w:type="dxa" w:w="1872"/>
+          </w:tcPr>
+          <w:p>
+            <w:r>
+              <w:t>70.0%</w:t>
+            </w:r>
+          </w:p>
+        </w:tc>
+        <w:tc>
+          <w:tcPr>
+            <w:tcW w:type="dxa" w:w="1872"/>
+          </w:tcPr>
+          <w:p>
+            <w:r>
+              <w:t>70.0%</w:t>
+            </w:r>
+          </w:p>
+        </w:tc>
+        <w:tc>
+          <w:tcPr>
+            <w:tcW w:type="dxa" w:w="1872"/>
+          </w:tcPr>
+          <w:p>
+            <w:r>
+              <w:t>87.0%</w:t>
+            </w:r>
+          </w:p>
+        </w:tc>
+      </w:tr>
+      <w:tr>
+        <w:tc>
+          <w:tcPr>
+            <w:tcW w:type="dxa" w:w="1872"/>
+          </w:tcPr>
+          <w:p>
+            <w:r>
+              <w:t>Claude Sonnet 4</w:t>
+            </w:r>
+          </w:p>
+        </w:tc>
+        <w:tc>
+          <w:tcPr>
+            <w:tcW w:type="dxa" w:w="1872"/>
+          </w:tcPr>
+          <w:p>
+            <w:r>
+              <w:t>79.3%</w:t>
+            </w:r>
+          </w:p>
+        </w:tc>
+        <w:tc>
+          <w:tcPr>
+            <w:tcW w:type="dxa" w:w="1872"/>
+          </w:tcPr>
+          <w:p>
+            <w:r>
+              <w:t>77.0%</w:t>
+            </w:r>
+          </w:p>
+        </w:tc>
+        <w:tc>
+          <w:tcPr>
+            <w:tcW w:type="dxa" w:w="1872"/>
+          </w:tcPr>
+          <w:p>
+            <w:r>
+              <w:t>67.0%</w:t>
+            </w:r>
+          </w:p>
+        </w:tc>
+        <w:tc>
+          <w:tcPr>
+            <w:tcW w:type="dxa" w:w="1872"/>
+          </w:tcPr>
+          <w:p>
+            <w:r>
+              <w:t>N/A</w:t>
+            </w:r>
+          </w:p>
+        </w:tc>
+      </w:tr>
+    </w:tbl>
+    <w:p>
+      <w:r>
+        <w:t>Table 9: Text reference quality ablation.</w:t>
+      </w:r>
+    </w:p>
     <w:p>
       <w:pPr>
         <w:jc w:val="center"/>
@@ -35047,1320 +36111,6 @@
         <w:rPr>
           <w:rtl w:val="0"/>
         </w:rPr>
-      </w:r>
-    </w:p>
-    <w:p>
-      <w:r>
-        <w:rPr>
-          <w:b/>
-          <w:sz w:val="18"/>
-        </w:rPr>
-        <w:t>Table N: Cross-model text reference verification results. The A→B lift largely disappears when using independently generated references.</w:t>
-      </w:r>
-    </w:p>
-    <w:tbl>
-      <w:tblPr>
-        <w:tblW w:type="auto" w:w="0"/>
-        <w:tblLook w:firstColumn="1" w:firstRow="1" w:lastColumn="0" w:lastRow="0" w:noHBand="0" w:noVBand="1" w:val="04A0"/>
-      </w:tblPr>
-      <w:tblGrid>
-        <w:gridCol w:w="1872"/>
-        <w:gridCol w:w="1872"/>
-        <w:gridCol w:w="1872"/>
-        <w:gridCol w:w="1872"/>
-        <w:gridCol w:w="1872"/>
-      </w:tblGrid>
-      <w:tr>
-        <w:tc>
-          <w:tcPr>
-            <w:tcW w:type="dxa" w:w="1872"/>
-          </w:tcPr>
-          <w:p>
-            <w:r>
-              <w:t>Model</w:t>
-            </w:r>
-          </w:p>
-        </w:tc>
-        <w:tc>
-          <w:tcPr>
-            <w:tcW w:type="dxa" w:w="1872"/>
-          </w:tcPr>
-          <w:p>
-            <w:r>
-              <w:t>Condition</w:t>
-            </w:r>
-          </w:p>
-        </w:tc>
-        <w:tc>
-          <w:tcPr>
-            <w:tcW w:type="dxa" w:w="1872"/>
-          </w:tcPr>
-          <w:p>
-            <w:r>
-              <w:t>Refs</w:t>
-            </w:r>
-          </w:p>
-        </w:tc>
-        <w:tc>
-          <w:tcPr>
-            <w:tcW w:type="dxa" w:w="1872"/>
-          </w:tcPr>
-          <w:p>
-            <w:r>
-              <w:t>Accuracy</w:t>
-            </w:r>
-          </w:p>
-        </w:tc>
-        <w:tc>
-          <w:tcPr>
-            <w:tcW w:type="dxa" w:w="1872"/>
-          </w:tcPr>
-          <w:p>
-            <w:r>
-              <w:t>A→B Lift</w:t>
-            </w:r>
-          </w:p>
-        </w:tc>
-      </w:tr>
-      <w:tr>
-        <w:tc>
-          <w:tcPr>
-            <w:tcW w:type="dxa" w:w="1872"/>
-          </w:tcPr>
-          <w:p>
-            <w:r>
-              <w:t>GPT-4.1 Nano</w:t>
-            </w:r>
-          </w:p>
-        </w:tc>
-        <w:tc>
-          <w:tcPr>
-            <w:tcW w:type="dxa" w:w="1872"/>
-          </w:tcPr>
-          <w:p>
-            <w:r>
-              <w:t>B</w:t>
-            </w:r>
-          </w:p>
-        </w:tc>
-        <w:tc>
-          <w:tcPr>
-            <w:tcW w:type="dxa" w:w="1872"/>
-          </w:tcPr>
-          <w:p>
-            <w:r>
-              <w:t>Self-generated</w:t>
-            </w:r>
-          </w:p>
-        </w:tc>
-        <w:tc>
-          <w:tcPr>
-            <w:tcW w:type="dxa" w:w="1872"/>
-          </w:tcPr>
-          <w:p>
-            <w:r>
-              <w:t>83.5%</w:t>
-            </w:r>
-          </w:p>
-        </w:tc>
-        <w:tc>
-          <w:tcPr>
-            <w:tcW w:type="dxa" w:w="1872"/>
-          </w:tcPr>
-          <w:p>
-            <w:r>
-              <w:t>+6.9pp</w:t>
-            </w:r>
-          </w:p>
-        </w:tc>
-      </w:tr>
-      <w:tr>
-        <w:tc>
-          <w:tcPr>
-            <w:tcW w:type="dxa" w:w="1872"/>
-          </w:tcPr>
-          <w:p>
-            <w:r>
-              <w:t>GPT-4.1 Nano</w:t>
-            </w:r>
-          </w:p>
-        </w:tc>
-        <w:tc>
-          <w:tcPr>
-            <w:tcW w:type="dxa" w:w="1872"/>
-          </w:tcPr>
-          <w:p>
-            <w:r>
-              <w:t>B</w:t>
-            </w:r>
-          </w:p>
-        </w:tc>
-        <w:tc>
-          <w:tcPr>
-            <w:tcW w:type="dxa" w:w="1872"/>
-          </w:tcPr>
-          <w:p>
-            <w:r>
-              <w:t>GPT-4.1-mini</w:t>
-            </w:r>
-          </w:p>
-        </w:tc>
-        <w:tc>
-          <w:tcPr>
-            <w:tcW w:type="dxa" w:w="1872"/>
-          </w:tcPr>
-          <w:p>
-            <w:r>
-              <w:t>76.8%</w:t>
-            </w:r>
-          </w:p>
-        </w:tc>
-        <w:tc>
-          <w:tcPr>
-            <w:tcW w:type="dxa" w:w="1872"/>
-          </w:tcPr>
-          <w:p>
-            <w:r>
-              <w:t>+0.2pp</w:t>
-            </w:r>
-          </w:p>
-        </w:tc>
-      </w:tr>
-      <w:tr>
-        <w:tc>
-          <w:tcPr>
-            <w:tcW w:type="dxa" w:w="1872"/>
-          </w:tcPr>
-          <w:p>
-            <w:r>
-              <w:t>GPT-4.1 Nano</w:t>
-            </w:r>
-          </w:p>
-        </w:tc>
-        <w:tc>
-          <w:tcPr>
-            <w:tcW w:type="dxa" w:w="1872"/>
-          </w:tcPr>
-          <w:p>
-            <w:r>
-              <w:t>B</w:t>
-            </w:r>
-          </w:p>
-        </w:tc>
-        <w:tc>
-          <w:tcPr>
-            <w:tcW w:type="dxa" w:w="1872"/>
-          </w:tcPr>
-          <w:p>
-            <w:r>
-              <w:t>Claude Sonnet 4</w:t>
-            </w:r>
-          </w:p>
-        </w:tc>
-        <w:tc>
-          <w:tcPr>
-            <w:tcW w:type="dxa" w:w="1872"/>
-          </w:tcPr>
-          <w:p>
-            <w:r>
-              <w:t>79.4%</w:t>
-            </w:r>
-          </w:p>
-        </w:tc>
-        <w:tc>
-          <w:tcPr>
-            <w:tcW w:type="dxa" w:w="1872"/>
-          </w:tcPr>
-          <w:p>
-            <w:r>
-              <w:t>+2.9pp</w:t>
-            </w:r>
-          </w:p>
-        </w:tc>
-      </w:tr>
-    </w:tbl>
-    <w:p>
-      <w:r>
-        <w:rPr>
-          <w:b/>
-          <w:sz w:val="18"/>
-        </w:rPr>
-        <w:t>Table N: Cross-model text reference verification results. The A→B lift largely disappears when using independently generated references.</w:t>
-      </w:r>
-    </w:p>
-    <w:tbl>
-      <w:tblPr>
-        <w:tblW w:type="auto" w:w="0"/>
-        <w:tblLook w:firstColumn="1" w:firstRow="1" w:lastColumn="0" w:lastRow="0" w:noHBand="0" w:noVBand="1" w:val="04A0"/>
-      </w:tblPr>
-      <w:tblGrid>
-        <w:gridCol w:w="1560"/>
-        <w:gridCol w:w="1560"/>
-        <w:gridCol w:w="1560"/>
-        <w:gridCol w:w="1560"/>
-        <w:gridCol w:w="1560"/>
-        <w:gridCol w:w="1560"/>
-      </w:tblGrid>
-      <w:tr>
-        <w:tc>
-          <w:tcPr>
-            <w:tcW w:type="dxa" w:w="1560"/>
-          </w:tcPr>
-          <w:p>
-            <w:r>
-              <w:t>Model</w:t>
-            </w:r>
-          </w:p>
-        </w:tc>
-        <w:tc>
-          <w:tcPr>
-            <w:tcW w:type="dxa" w:w="1560"/>
-          </w:tcPr>
-          <w:p>
-            <w:r>
-              <w:t>Condition</w:t>
-            </w:r>
-          </w:p>
-        </w:tc>
-        <w:tc>
-          <w:tcPr>
-            <w:tcW w:type="dxa" w:w="1560"/>
-          </w:tcPr>
-          <w:p>
-            <w:r>
-              <w:t>Errors</w:t>
-            </w:r>
-          </w:p>
-        </w:tc>
-        <w:tc>
-          <w:tcPr>
-            <w:tcW w:type="dxa" w:w="1560"/>
-          </w:tcPr>
-          <w:p>
-            <w:r>
-              <w:t>ITT Lower</w:t>
-            </w:r>
-          </w:p>
-        </w:tc>
-        <w:tc>
-          <w:tcPr>
-            <w:tcW w:type="dxa" w:w="1560"/>
-          </w:tcPr>
-          <w:p>
-            <w:r>
-              <w:t>ITT Upper</w:t>
-            </w:r>
-          </w:p>
-        </w:tc>
-        <w:tc>
-          <w:tcPr>
-            <w:tcW w:type="dxa" w:w="1560"/>
-          </w:tcPr>
-          <w:p>
-            <w:r>
-              <w:t>Per-Protocol</w:t>
-            </w:r>
-          </w:p>
-        </w:tc>
-      </w:tr>
-      <w:tr>
-        <w:tc>
-          <w:tcPr>
-            <w:tcW w:type="dxa" w:w="1560"/>
-          </w:tcPr>
-          <w:p>
-            <w:r>
-              <w:t>GPT-4.1 Nano</w:t>
-            </w:r>
-          </w:p>
-        </w:tc>
-        <w:tc>
-          <w:tcPr>
-            <w:tcW w:type="dxa" w:w="1560"/>
-          </w:tcPr>
-          <w:p>
-            <w:r>
-              <w:t>A</w:t>
-            </w:r>
-          </w:p>
-        </w:tc>
-        <w:tc>
-          <w:tcPr>
-            <w:tcW w:type="dxa" w:w="1560"/>
-          </w:tcPr>
-          <w:p>
-            <w:r>
-              <w:t>10 (1.1%)</w:t>
-            </w:r>
-          </w:p>
-        </w:tc>
-        <w:tc>
-          <w:tcPr>
-            <w:tcW w:type="dxa" w:w="1560"/>
-          </w:tcPr>
-          <w:p>
-            <w:r>
-              <w:t>76.6%</w:t>
-            </w:r>
-          </w:p>
-        </w:tc>
-        <w:tc>
-          <w:tcPr>
-            <w:tcW w:type="dxa" w:w="1560"/>
-          </w:tcPr>
-          <w:p>
-            <w:r>
-              <w:t>77.7%</w:t>
-            </w:r>
-          </w:p>
-        </w:tc>
-        <w:tc>
-          <w:tcPr>
-            <w:tcW w:type="dxa" w:w="1560"/>
-          </w:tcPr>
-          <w:p>
-            <w:r>
-              <w:t>77.4%</w:t>
-            </w:r>
-          </w:p>
-        </w:tc>
-      </w:tr>
-      <w:tr>
-        <w:tc>
-          <w:tcPr>
-            <w:tcW w:type="dxa" w:w="1560"/>
-          </w:tcPr>
-          <w:p>
-            <w:r>
-              <w:t>GPT-4.1 Nano</w:t>
-            </w:r>
-          </w:p>
-        </w:tc>
-        <w:tc>
-          <w:tcPr>
-            <w:tcW w:type="dxa" w:w="1560"/>
-          </w:tcPr>
-          <w:p>
-            <w:r>
-              <w:t>B</w:t>
-            </w:r>
-          </w:p>
-        </w:tc>
-        <w:tc>
-          <w:tcPr>
-            <w:tcW w:type="dxa" w:w="1560"/>
-          </w:tcPr>
-          <w:p>
-            <w:r>
-              <w:t>10 (1.1%)</w:t>
-            </w:r>
-          </w:p>
-        </w:tc>
-        <w:tc>
-          <w:tcPr>
-            <w:tcW w:type="dxa" w:w="1560"/>
-          </w:tcPr>
-          <w:p>
-            <w:r>
-              <w:t>82.7%</w:t>
-            </w:r>
-          </w:p>
-        </w:tc>
-        <w:tc>
-          <w:tcPr>
-            <w:tcW w:type="dxa" w:w="1560"/>
-          </w:tcPr>
-          <w:p>
-            <w:r>
-              <w:t>83.8%</w:t>
-            </w:r>
-          </w:p>
-        </w:tc>
-        <w:tc>
-          <w:tcPr>
-            <w:tcW w:type="dxa" w:w="1560"/>
-          </w:tcPr>
-          <w:p>
-            <w:r>
-              <w:t>83.7%</w:t>
-            </w:r>
-          </w:p>
-        </w:tc>
-      </w:tr>
-      <w:tr>
-        <w:tc>
-          <w:tcPr>
-            <w:tcW w:type="dxa" w:w="1560"/>
-          </w:tcPr>
-          <w:p>
-            <w:r>
-              <w:t>GPT-4.1 Nano</w:t>
-            </w:r>
-          </w:p>
-        </w:tc>
-        <w:tc>
-          <w:tcPr>
-            <w:tcW w:type="dxa" w:w="1560"/>
-          </w:tcPr>
-          <w:p>
-            <w:r>
-              <w:t>C</w:t>
-            </w:r>
-          </w:p>
-        </w:tc>
-        <w:tc>
-          <w:tcPr>
-            <w:tcW w:type="dxa" w:w="1560"/>
-          </w:tcPr>
-          <w:p>
-            <w:r>
-              <w:t>4 (2.8%)</w:t>
-            </w:r>
-          </w:p>
-        </w:tc>
-        <w:tc>
-          <w:tcPr>
-            <w:tcW w:type="dxa" w:w="1560"/>
-          </w:tcPr>
-          <w:p>
-            <w:r>
-              <w:t>60.5%</w:t>
-            </w:r>
-          </w:p>
-        </w:tc>
-        <w:tc>
-          <w:tcPr>
-            <w:tcW w:type="dxa" w:w="1560"/>
-          </w:tcPr>
-          <w:p>
-            <w:r>
-              <w:t>63.3%</w:t>
-            </w:r>
-          </w:p>
-        </w:tc>
-        <w:tc>
-          <w:tcPr>
-            <w:tcW w:type="dxa" w:w="1560"/>
-          </w:tcPr>
-          <w:p>
-            <w:r>
-              <w:t>62.2%</w:t>
-            </w:r>
-          </w:p>
-        </w:tc>
-      </w:tr>
-      <w:tr>
-        <w:tc>
-          <w:tcPr>
-            <w:tcW w:type="dxa" w:w="1560"/>
-          </w:tcPr>
-          <w:p>
-            <w:r>
-              <w:t>GPT-4.1 Nano</w:t>
-            </w:r>
-          </w:p>
-        </w:tc>
-        <w:tc>
-          <w:tcPr>
-            <w:tcW w:type="dxa" w:w="1560"/>
-          </w:tcPr>
-          <w:p>
-            <w:r>
-              <w:t>D</w:t>
-            </w:r>
-          </w:p>
-        </w:tc>
-        <w:tc>
-          <w:tcPr>
-            <w:tcW w:type="dxa" w:w="1560"/>
-          </w:tcPr>
-          <w:p>
-            <w:r>
-              <w:t>5 (3.4%)</w:t>
-            </w:r>
-          </w:p>
-        </w:tc>
-        <w:tc>
-          <w:tcPr>
-            <w:tcW w:type="dxa" w:w="1560"/>
-          </w:tcPr>
-          <w:p>
-            <w:r>
-              <w:t>72.4%</w:t>
-            </w:r>
-          </w:p>
-        </w:tc>
-        <w:tc>
-          <w:tcPr>
-            <w:tcW w:type="dxa" w:w="1560"/>
-          </w:tcPr>
-          <w:p>
-            <w:r>
-              <w:t>76.6%</w:t>
-            </w:r>
-          </w:p>
-        </w:tc>
-        <w:tc>
-          <w:tcPr>
-            <w:tcW w:type="dxa" w:w="1560"/>
-          </w:tcPr>
-          <w:p>
-            <w:r>
-              <w:t>75.2%</w:t>
-            </w:r>
-          </w:p>
-        </w:tc>
-      </w:tr>
-    </w:tbl>
-    <w:p>
-      <w:r>
-        <w:rPr>
-          <w:b/>
-          <w:sz w:val="18"/>
-        </w:rPr>
-        <w:t>Table N: Intent-to-treat (ITT) bounds and per-protocol accuracy.</w:t>
-      </w:r>
-    </w:p>
-    <w:tbl>
-      <w:tblPr>
-        <w:tblW w:type="auto" w:w="0"/>
-        <w:tblLook w:firstColumn="1" w:firstRow="1" w:lastColumn="0" w:lastRow="0" w:noHBand="0" w:noVBand="1" w:val="04A0"/>
-      </w:tblPr>
-      <w:tblGrid>
-        <w:gridCol w:w="1560"/>
-        <w:gridCol w:w="1560"/>
-        <w:gridCol w:w="1560"/>
-        <w:gridCol w:w="1560"/>
-        <w:gridCol w:w="1560"/>
-        <w:gridCol w:w="1560"/>
-      </w:tblGrid>
-      <w:tr>
-        <w:tc>
-          <w:tcPr>
-            <w:tcW w:type="dxa" w:w="1560"/>
-          </w:tcPr>
-          <w:p>
-            <w:r>
-              <w:t>Model</w:t>
-            </w:r>
-          </w:p>
-        </w:tc>
-        <w:tc>
-          <w:tcPr>
-            <w:tcW w:type="dxa" w:w="1560"/>
-          </w:tcPr>
-          <w:p>
-            <w:r>
-              <w:t>Condition</w:t>
-            </w:r>
-          </w:p>
-        </w:tc>
-        <w:tc>
-          <w:tcPr>
-            <w:tcW w:type="dxa" w:w="1560"/>
-          </w:tcPr>
-          <w:p>
-            <w:r>
-              <w:t>Obvious</w:t>
-            </w:r>
-          </w:p>
-        </w:tc>
-        <w:tc>
-          <w:tcPr>
-            <w:tcW w:type="dxa" w:w="1560"/>
-          </w:tcPr>
-          <w:p>
-            <w:r>
-              <w:t>Deceptive</w:t>
-            </w:r>
-          </w:p>
-        </w:tc>
-        <w:tc>
-          <w:tcPr>
-            <w:tcW w:type="dxa" w:w="1560"/>
-          </w:tcPr>
-          <w:p>
-            <w:r>
-              <w:t>Partial</w:t>
-            </w:r>
-          </w:p>
-        </w:tc>
-        <w:tc>
-          <w:tcPr>
-            <w:tcW w:type="dxa" w:w="1560"/>
-          </w:tcPr>
-          <w:p>
-            <w:r>
-              <w:t>Overall</w:t>
-            </w:r>
-          </w:p>
-        </w:tc>
-      </w:tr>
-      <w:tr>
-        <w:tc>
-          <w:tcPr>
-            <w:tcW w:type="dxa" w:w="1560"/>
-          </w:tcPr>
-          <w:p>
-            <w:r>
-              <w:t>GPT-4.1 Nano</w:t>
-            </w:r>
-          </w:p>
-        </w:tc>
-        <w:tc>
-          <w:tcPr>
-            <w:tcW w:type="dxa" w:w="1560"/>
-          </w:tcPr>
-          <w:p>
-            <w:r>
-              <w:t>A</w:t>
-            </w:r>
-          </w:p>
-        </w:tc>
-        <w:tc>
-          <w:tcPr>
-            <w:tcW w:type="dxa" w:w="1560"/>
-          </w:tcPr>
-          <w:p>
-            <w:r>
-              <w:t>76.5%</w:t>
-            </w:r>
-          </w:p>
-        </w:tc>
-        <w:tc>
-          <w:tcPr>
-            <w:tcW w:type="dxa" w:w="1560"/>
-          </w:tcPr>
-          <w:p>
-            <w:r>
-              <w:t>83.8%</w:t>
-            </w:r>
-          </w:p>
-        </w:tc>
-        <w:tc>
-          <w:tcPr>
-            <w:tcW w:type="dxa" w:w="1560"/>
-          </w:tcPr>
-          <w:p>
-            <w:r>
-              <w:t>93.6%</w:t>
-            </w:r>
-          </w:p>
-        </w:tc>
-        <w:tc>
-          <w:tcPr>
-            <w:tcW w:type="dxa" w:w="1560"/>
-          </w:tcPr>
-          <w:p>
-            <w:r>
-              <w:t>77.4%</w:t>
-            </w:r>
-          </w:p>
-        </w:tc>
-      </w:tr>
-      <w:tr>
-        <w:tc>
-          <w:tcPr>
-            <w:tcW w:type="dxa" w:w="1560"/>
-          </w:tcPr>
-          <w:p>
-            <w:r>
-              <w:t>GPT-4.1 Nano</w:t>
-            </w:r>
-          </w:p>
-        </w:tc>
-        <w:tc>
-          <w:tcPr>
-            <w:tcW w:type="dxa" w:w="1560"/>
-          </w:tcPr>
-          <w:p>
-            <w:r>
-              <w:t>B</w:t>
-            </w:r>
-          </w:p>
-        </w:tc>
-        <w:tc>
-          <w:tcPr>
-            <w:tcW w:type="dxa" w:w="1560"/>
-          </w:tcPr>
-          <w:p>
-            <w:r>
-              <w:t>83.0%</w:t>
-            </w:r>
-          </w:p>
-        </w:tc>
-        <w:tc>
-          <w:tcPr>
-            <w:tcW w:type="dxa" w:w="1560"/>
-          </w:tcPr>
-          <w:p>
-            <w:r>
-              <w:t>86.6%</w:t>
-            </w:r>
-          </w:p>
-        </w:tc>
-        <w:tc>
-          <w:tcPr>
-            <w:tcW w:type="dxa" w:w="1560"/>
-          </w:tcPr>
-          <w:p>
-            <w:r>
-              <w:t>94.3%</w:t>
-            </w:r>
-          </w:p>
-        </w:tc>
-        <w:tc>
-          <w:tcPr>
-            <w:tcW w:type="dxa" w:w="1560"/>
-          </w:tcPr>
-          <w:p>
-            <w:r>
-              <w:t>83.7%</w:t>
-            </w:r>
-          </w:p>
-        </w:tc>
-      </w:tr>
-      <w:tr>
-        <w:tc>
-          <w:tcPr>
-            <w:tcW w:type="dxa" w:w="1560"/>
-          </w:tcPr>
-          <w:p>
-            <w:r>
-              <w:t>GPT-4.1 Mini</w:t>
-            </w:r>
-          </w:p>
-        </w:tc>
-        <w:tc>
-          <w:tcPr>
-            <w:tcW w:type="dxa" w:w="1560"/>
-          </w:tcPr>
-          <w:p>
-            <w:r>
-              <w:t>A</w:t>
-            </w:r>
-          </w:p>
-        </w:tc>
-        <w:tc>
-          <w:tcPr>
-            <w:tcW w:type="dxa" w:w="1560"/>
-          </w:tcPr>
-          <w:p>
-            <w:r>
-              <w:t>82.4%</w:t>
-            </w:r>
-          </w:p>
-        </w:tc>
-        <w:tc>
-          <w:tcPr>
-            <w:tcW w:type="dxa" w:w="1560"/>
-          </w:tcPr>
-          <w:p>
-            <w:r>
-              <w:t>86.3%</w:t>
-            </w:r>
-          </w:p>
-        </w:tc>
-        <w:tc>
-          <w:tcPr>
-            <w:tcW w:type="dxa" w:w="1560"/>
-          </w:tcPr>
-          <w:p>
-            <w:r>
-              <w:t>94.3%</w:t>
-            </w:r>
-          </w:p>
-        </w:tc>
-        <w:tc>
-          <w:tcPr>
-            <w:tcW w:type="dxa" w:w="1560"/>
-          </w:tcPr>
-          <w:p>
-            <w:r>
-              <w:t>80.9%</w:t>
-            </w:r>
-          </w:p>
-        </w:tc>
-      </w:tr>
-      <w:tr>
-        <w:tc>
-          <w:tcPr>
-            <w:tcW w:type="dxa" w:w="1560"/>
-          </w:tcPr>
-          <w:p>
-            <w:r>
-              <w:t>GPT-4.1 Mini</w:t>
-            </w:r>
-          </w:p>
-        </w:tc>
-        <w:tc>
-          <w:tcPr>
-            <w:tcW w:type="dxa" w:w="1560"/>
-          </w:tcPr>
-          <w:p>
-            <w:r>
-              <w:t>B</w:t>
-            </w:r>
-          </w:p>
-        </w:tc>
-        <w:tc>
-          <w:tcPr>
-            <w:tcW w:type="dxa" w:w="1560"/>
-          </w:tcPr>
-          <w:p>
-            <w:r>
-              <w:t>88.9%</w:t>
-            </w:r>
-          </w:p>
-        </w:tc>
-        <w:tc>
-          <w:tcPr>
-            <w:tcW w:type="dxa" w:w="1560"/>
-          </w:tcPr>
-          <w:p>
-            <w:r>
-              <w:t>90.1%</w:t>
-            </w:r>
-          </w:p>
-        </w:tc>
-        <w:tc>
-          <w:tcPr>
-            <w:tcW w:type="dxa" w:w="1560"/>
-          </w:tcPr>
-          <w:p>
-            <w:r>
-              <w:t>95.6%</w:t>
-            </w:r>
-          </w:p>
-        </w:tc>
-        <w:tc>
-          <w:tcPr>
-            <w:tcW w:type="dxa" w:w="1560"/>
-          </w:tcPr>
-          <w:p>
-            <w:r>
-              <w:t>86.5%</w:t>
-            </w:r>
-          </w:p>
-        </w:tc>
-      </w:tr>
-    </w:tbl>
-    <w:p>
-      <w:r>
-        <w:rPr>
-          <w:b/>
-          <w:sz w:val="18"/>
-        </w:rPr>
-        <w:t>Table N: Verification accuracy by failure type.</w:t>
-      </w:r>
-    </w:p>
-    <w:tbl>
-      <w:tblPr>
-        <w:tblW w:type="auto" w:w="0"/>
-        <w:tblLook w:firstColumn="1" w:firstRow="1" w:lastColumn="0" w:lastRow="0" w:noHBand="0" w:noVBand="1" w:val="04A0"/>
-      </w:tblPr>
-      <w:tblGrid>
-        <w:gridCol w:w="1872"/>
-        <w:gridCol w:w="1872"/>
-        <w:gridCol w:w="1872"/>
-        <w:gridCol w:w="1872"/>
-        <w:gridCol w:w="1872"/>
-      </w:tblGrid>
-      <w:tr>
-        <w:tc>
-          <w:tcPr>
-            <w:tcW w:type="dxa" w:w="1872"/>
-          </w:tcPr>
-          <w:p>
-            <w:r>
-              <w:t>Model</w:t>
-            </w:r>
-          </w:p>
-        </w:tc>
-        <w:tc>
-          <w:tcPr>
-            <w:tcW w:type="dxa" w:w="1872"/>
-          </w:tcPr>
-          <w:p>
-            <w:r>
-              <w:t>Original</w:t>
-            </w:r>
-          </w:p>
-        </w:tc>
-        <w:tc>
-          <w:tcPr>
-            <w:tcW w:type="dxa" w:w="1872"/>
-          </w:tcPr>
-          <w:p>
-            <w:r>
-              <w:t>Short</w:t>
-            </w:r>
-          </w:p>
-        </w:tc>
-        <w:tc>
-          <w:tcPr>
-            <w:tcW w:type="dxa" w:w="1872"/>
-          </w:tcPr>
-          <w:p>
-            <w:r>
-              <w:t>Noisy</w:t>
-            </w:r>
-          </w:p>
-        </w:tc>
-        <w:tc>
-          <w:tcPr>
-            <w:tcW w:type="dxa" w:w="1872"/>
-          </w:tcPr>
-          <w:p>
-            <w:r>
-              <w:t>Wrong</w:t>
-            </w:r>
-          </w:p>
-        </w:tc>
-      </w:tr>
-      <w:tr>
-        <w:tc>
-          <w:tcPr>
-            <w:tcW w:type="dxa" w:w="1872"/>
-          </w:tcPr>
-          <w:p>
-            <w:r>
-              <w:t>GPT-4.1 Mini</w:t>
-            </w:r>
-          </w:p>
-        </w:tc>
-        <w:tc>
-          <w:tcPr>
-            <w:tcW w:type="dxa" w:w="1872"/>
-          </w:tcPr>
-          <w:p>
-            <w:r>
-              <w:t>86.5%</w:t>
-            </w:r>
-          </w:p>
-        </w:tc>
-        <w:tc>
-          <w:tcPr>
-            <w:tcW w:type="dxa" w:w="1872"/>
-          </w:tcPr>
-          <w:p>
-            <w:r>
-              <w:t>70.0%</w:t>
-            </w:r>
-          </w:p>
-        </w:tc>
-        <w:tc>
-          <w:tcPr>
-            <w:tcW w:type="dxa" w:w="1872"/>
-          </w:tcPr>
-          <w:p>
-            <w:r>
-              <w:t>70.0%</w:t>
-            </w:r>
-          </w:p>
-        </w:tc>
-        <w:tc>
-          <w:tcPr>
-            <w:tcW w:type="dxa" w:w="1872"/>
-          </w:tcPr>
-          <w:p>
-            <w:r>
-              <w:t>87.0%</w:t>
-            </w:r>
-          </w:p>
-        </w:tc>
-      </w:tr>
-      <w:tr>
-        <w:tc>
-          <w:tcPr>
-            <w:tcW w:type="dxa" w:w="1872"/>
-          </w:tcPr>
-          <w:p>
-            <w:r>
-              <w:t>Claude Sonnet 4</w:t>
-            </w:r>
-          </w:p>
-        </w:tc>
-        <w:tc>
-          <w:tcPr>
-            <w:tcW w:type="dxa" w:w="1872"/>
-          </w:tcPr>
-          <w:p>
-            <w:r>
-              <w:t>79.3%</w:t>
-            </w:r>
-          </w:p>
-        </w:tc>
-        <w:tc>
-          <w:tcPr>
-            <w:tcW w:type="dxa" w:w="1872"/>
-          </w:tcPr>
-          <w:p>
-            <w:r>
-              <w:t>77.0%</w:t>
-            </w:r>
-          </w:p>
-        </w:tc>
-        <w:tc>
-          <w:tcPr>
-            <w:tcW w:type="dxa" w:w="1872"/>
-          </w:tcPr>
-          <w:p>
-            <w:r>
-              <w:t>67.0%</w:t>
-            </w:r>
-          </w:p>
-        </w:tc>
-        <w:tc>
-          <w:tcPr>
-            <w:tcW w:type="dxa" w:w="1872"/>
-          </w:tcPr>
-          <w:p>
-            <w:r>
-              <w:t>N/A</w:t>
-            </w:r>
-          </w:p>
-        </w:tc>
-      </w:tr>
-    </w:tbl>
-    <w:p>
-      <w:r>
-        <w:rPr>
-          <w:b/>
-          <w:sz w:val="18"/>
-        </w:rPr>
-        <w:t>Table N: Text reference quality ablation.</w:t>
-      </w:r>
-    </w:p>
-    <w:tbl>
-      <w:tblPr>
-        <w:tblW w:type="auto" w:w="0"/>
-        <w:tblLook w:firstColumn="1" w:firstRow="1" w:lastColumn="0" w:lastRow="0" w:noHBand="0" w:noVBand="1" w:val="04A0"/>
-      </w:tblPr>
-      <w:tblGrid>
-        <w:gridCol w:w="2340"/>
-        <w:gridCol w:w="2340"/>
-        <w:gridCol w:w="2340"/>
-        <w:gridCol w:w="2340"/>
-      </w:tblGrid>
-      <w:tr>
-        <w:tc>
-          <w:tcPr>
-            <w:tcW w:type="dxa" w:w="2340"/>
-          </w:tcPr>
-          <w:p>
-            <w:r>
-              <w:t>Method</w:t>
-            </w:r>
-          </w:p>
-        </w:tc>
-        <w:tc>
-          <w:tcPr>
-            <w:tcW w:type="dxa" w:w="2340"/>
-          </w:tcPr>
-          <w:p>
-            <w:r>
-              <w:t>Accuracy</w:t>
-            </w:r>
-          </w:p>
-        </w:tc>
-        <w:tc>
-          <w:tcPr>
-            <w:tcW w:type="dxa" w:w="2340"/>
-          </w:tcPr>
-          <w:p>
-            <w:r>
-              <w:t>F1</w:t>
-            </w:r>
-          </w:p>
-        </w:tc>
-        <w:tc>
-          <w:tcPr>
-            <w:tcW w:type="dxa" w:w="2340"/>
-          </w:tcPr>
-          <w:p>
-            <w:r>
-              <w:t>FPR</w:t>
-            </w:r>
-          </w:p>
-        </w:tc>
-      </w:tr>
-      <w:tr>
-        <w:tc>
-          <w:tcPr>
-            <w:tcW w:type="dxa" w:w="2340"/>
-          </w:tcPr>
-          <w:p>
-            <w:r>
-              <w:t>pHash</w:t>
-            </w:r>
-          </w:p>
-        </w:tc>
-        <w:tc>
-          <w:tcPr>
-            <w:tcW w:type="dxa" w:w="2340"/>
-          </w:tcPr>
-          <w:p>
-            <w:r>
-              <w:t>69.4%</w:t>
-            </w:r>
-          </w:p>
-        </w:tc>
-        <w:tc>
-          <w:tcPr>
-            <w:tcW w:type="dxa" w:w="2340"/>
-          </w:tcPr>
-          <w:p>
-            <w:r>
-              <w:t>10.0%</w:t>
-            </w:r>
-          </w:p>
-        </w:tc>
-        <w:tc>
-          <w:tcPr>
-            <w:tcW w:type="dxa" w:w="2340"/>
-          </w:tcPr>
-          <w:p>
-            <w:r>
-              <w:t>19.2%</w:t>
-            </w:r>
-          </w:p>
-        </w:tc>
-      </w:tr>
-      <w:tr>
-        <w:tc>
-          <w:tcPr>
-            <w:tcW w:type="dxa" w:w="2340"/>
-          </w:tcPr>
-          <w:p>
-            <w:r>
-              <w:t>SSIM</w:t>
-            </w:r>
-          </w:p>
-        </w:tc>
-        <w:tc>
-          <w:tcPr>
-            <w:tcW w:type="dxa" w:w="2340"/>
-          </w:tcPr>
-          <w:p>
-            <w:r>
-              <w:t>23.6%</w:t>
-            </w:r>
-          </w:p>
-        </w:tc>
-        <w:tc>
-          <w:tcPr>
-            <w:tcW w:type="dxa" w:w="2340"/>
-          </w:tcPr>
-          <w:p>
-            <w:r>
-              <w:t>27.9%</w:t>
-            </w:r>
-          </w:p>
-        </w:tc>
-        <w:tc>
-          <w:tcPr>
-            <w:tcW w:type="dxa" w:w="2340"/>
-          </w:tcPr>
-          <w:p>
-            <w:r>
-              <w:t>89.5%</w:t>
-            </w:r>
-          </w:p>
-        </w:tc>
-      </w:tr>
-      <w:tr>
-        <w:tc>
-          <w:tcPr>
-            <w:tcW w:type="dxa" w:w="2340"/>
-          </w:tcPr>
-          <w:p>
-            <w:r>
-              <w:t>GPT-4.1 Nano (A)</w:t>
-            </w:r>
-          </w:p>
-        </w:tc>
-        <w:tc>
-          <w:tcPr>
-            <w:tcW w:type="dxa" w:w="2340"/>
-          </w:tcPr>
-          <w:p>
-            <w:r>
-              <w:t>77.4%</w:t>
-            </w:r>
-          </w:p>
-        </w:tc>
-        <w:tc>
-          <w:tcPr>
-            <w:tcW w:type="dxa" w:w="2340"/>
-          </w:tcPr>
-          <w:p>
-            <w:r>
-              <w:t>32.6%</w:t>
-            </w:r>
-          </w:p>
-        </w:tc>
-        <w:tc>
-          <w:tcPr>
-            <w:tcW w:type="dxa" w:w="2340"/>
-          </w:tcPr>
-          <w:p>
-            <w:r>
-              <w:t>13.6%</w:t>
-            </w:r>
-          </w:p>
-        </w:tc>
-      </w:tr>
-      <w:tr>
-        <w:tc>
-          <w:tcPr>
-            <w:tcW w:type="dxa" w:w="2340"/>
-          </w:tcPr>
-          <w:p>
-            <w:r>
-              <w:t>GPT-4.1 Nano (B)</w:t>
-            </w:r>
-          </w:p>
-        </w:tc>
-        <w:tc>
-          <w:tcPr>
-            <w:tcW w:type="dxa" w:w="2340"/>
-          </w:tcPr>
-          <w:p>
-            <w:r>
-              <w:t>83.7%</w:t>
-            </w:r>
-          </w:p>
-        </w:tc>
-        <w:tc>
-          <w:tcPr>
-            <w:tcW w:type="dxa" w:w="2340"/>
-          </w:tcPr>
-          <w:p>
-            <w:r>
-              <w:t>48.8%</w:t>
-            </w:r>
-          </w:p>
-        </w:tc>
-        <w:tc>
-          <w:tcPr>
-            <w:tcW w:type="dxa" w:w="2340"/>
-          </w:tcPr>
-          <w:p>
-            <w:r>
-              <w:t>9.1%</w:t>
-            </w:r>
-          </w:p>
-        </w:tc>
-      </w:tr>
-    </w:tbl>
-    <w:p>
-      <w:r>
-        <w:rPr>
-          <w:b/>
-          <w:sz w:val="18"/>
-        </w:rPr>
-        <w:t>Table N: Non-LLM baseline comparison.</w:t>
       </w:r>
     </w:p>
     <w:sectPr>

</xml_diff>

<commit_message>
Fix figure caption terminology
</commit_message>
<xml_diff>
--- a/manuscripts/can_llm_web_agents_verify_their_own_work_revised.docx
+++ b/manuscripts/can_llm_web_agents_verify_their_own_work_revised.docx
@@ -2429,9 +2429,9 @@
           <w:szCs w:val="20"/>
           <w:rtl w:val="0"/>
         </w:rPr>
-        <w:br w:type="textWrapping"/>
-        <w:t xml:space="preserve">Figure 1: Visual Self-Verification Framework, inputs, prompt construction, and outputs for each of the four conditions (A–D).</w:t>
-        <w:br w:type="textWrapping"/>
+        <w:br/>
+        <w:t>Figure 1: Visual Post-Hoc Verification Framework, inputs, prompt construction, and outputs for each of the four conditions (A–D).</w:t>
+        <w:br/>
       </w:r>
     </w:p>
     <w:p>

</xml_diff>

<commit_message>
Add data availability statement - all 10 reviewer issues now addressed
</commit_message>
<xml_diff>
--- a/manuscripts/can_llm_web_agents_verify_their_own_work_revised.docx
+++ b/manuscripts/can_llm_web_agents_verify_their_own_work_revised.docx
@@ -20066,6 +20066,11 @@
         <w:rPr>
           <w:rtl w:val="0"/>
         </w:rPr>
+      </w:r>
+    </w:p>
+    <w:p>
+      <w:r>
+        <w:t>Data availability. Code and data are available at https://github.com/shravaniparsi/agentic-ui-test.</w:t>
       </w:r>
     </w:p>
     <w:p>

</xml_diff>